<commit_message>
Added Content of Quiz
</commit_message>
<xml_diff>
--- a/Study Notes.docx
+++ b/Study Notes.docx
@@ -5,14 +5,24 @@
     <w:p>
       <w:pPr>
         <w:rPr>
+          <w:b/>
+          <w:bCs/>
+          <w:i/>
+          <w:iCs/>
           <w:sz w:val="28"/>
           <w:szCs w:val="28"/>
-        </w:rPr>
-      </w:pPr>
-      <w:r>
-        <w:rPr>
+          <w:u w:val="single"/>
+        </w:rPr>
+      </w:pPr>
+      <w:r>
+        <w:rPr>
+          <w:b/>
+          <w:bCs/>
+          <w:i/>
+          <w:iCs/>
           <w:sz w:val="28"/>
           <w:szCs w:val="28"/>
+          <w:u w:val="single"/>
         </w:rPr>
         <w:t>Saliency Maps and Input-Space Interpretability Study Notes and Quick Reference</w:t>
       </w:r>
@@ -278,18 +288,38 @@
           <w:sz w:val="26"/>
           <w:szCs w:val="26"/>
         </w:rPr>
-        <w:t>There are various mathematical formulations that are used:</w:t>
-      </w:r>
-    </w:p>
-    <w:p>
-      <w:pPr>
-        <w:rPr>
-          <w:sz w:val="26"/>
-          <w:szCs w:val="26"/>
-        </w:rPr>
-      </w:pPr>
-      <w:r>
-        <w:rPr>
+        <w:t xml:space="preserve">There are various </w:t>
+      </w:r>
+      <w:r>
+        <w:rPr>
+          <w:b/>
+          <w:bCs/>
+          <w:sz w:val="26"/>
+          <w:szCs w:val="26"/>
+        </w:rPr>
+        <w:t>mathematical formulations</w:t>
+      </w:r>
+      <w:r>
+        <w:rPr>
+          <w:sz w:val="26"/>
+          <w:szCs w:val="26"/>
+        </w:rPr>
+        <w:t xml:space="preserve"> that are used:</w:t>
+      </w:r>
+    </w:p>
+    <w:p>
+      <w:pPr>
+        <w:rPr>
+          <w:b/>
+          <w:bCs/>
+          <w:sz w:val="26"/>
+          <w:szCs w:val="26"/>
+        </w:rPr>
+      </w:pPr>
+      <w:r>
+        <w:rPr>
+          <w:b/>
+          <w:bCs/>
           <w:sz w:val="26"/>
           <w:szCs w:val="26"/>
         </w:rPr>
@@ -543,12 +573,16 @@
     <w:p>
       <w:pPr>
         <w:rPr>
-          <w:sz w:val="26"/>
-          <w:szCs w:val="26"/>
-        </w:rPr>
-      </w:pPr>
-      <w:r>
-        <w:rPr>
+          <w:b/>
+          <w:bCs/>
+          <w:sz w:val="26"/>
+          <w:szCs w:val="26"/>
+        </w:rPr>
+      </w:pPr>
+      <w:r>
+        <w:rPr>
+          <w:b/>
+          <w:bCs/>
           <w:sz w:val="26"/>
           <w:szCs w:val="26"/>
         </w:rPr>
@@ -702,6 +736,8 @@
     <w:p>
       <w:pPr>
         <w:rPr>
+          <w:b/>
+          <w:bCs/>
           <w:sz w:val="26"/>
           <w:szCs w:val="26"/>
         </w:rPr>
@@ -709,6 +745,8 @@
       <w:proofErr w:type="spellStart"/>
       <w:r>
         <w:rPr>
+          <w:b/>
+          <w:bCs/>
           <w:sz w:val="26"/>
           <w:szCs w:val="26"/>
         </w:rPr>
@@ -1491,10 +1529,20 @@
       <w:r>
         <w:rPr>
           <w:rFonts w:eastAsiaTheme="minorEastAsia"/>
-          <w:sz w:val="26"/>
-          <w:szCs w:val="26"/>
-        </w:rPr>
-        <w:t xml:space="preserve">Saliency Maps and Input Gradient methods have a wide range of real-world applications. </w:t>
+          <w:b/>
+          <w:bCs/>
+          <w:sz w:val="26"/>
+          <w:szCs w:val="26"/>
+        </w:rPr>
+        <w:t>Saliency M</w:t>
+      </w:r>
+      <w:r>
+        <w:rPr>
+          <w:rFonts w:eastAsiaTheme="minorEastAsia"/>
+          <w:sz w:val="26"/>
+          <w:szCs w:val="26"/>
+        </w:rPr>
+        <w:t xml:space="preserve">aps and Input Gradient methods have a wide range of real-world applications. </w:t>
       </w:r>
     </w:p>
     <w:p>
@@ -1863,10 +1911,20 @@
       <w:r>
         <w:rPr>
           <w:rFonts w:eastAsiaTheme="minorEastAsia"/>
-          <w:sz w:val="26"/>
-          <w:szCs w:val="26"/>
-        </w:rPr>
-        <w:t>Example 1: Basic Input Gradients</w:t>
+          <w:b/>
+          <w:bCs/>
+          <w:sz w:val="26"/>
+          <w:szCs w:val="26"/>
+        </w:rPr>
+        <w:t>Example 1:</w:t>
+      </w:r>
+      <w:r>
+        <w:rPr>
+          <w:rFonts w:eastAsiaTheme="minorEastAsia"/>
+          <w:sz w:val="26"/>
+          <w:szCs w:val="26"/>
+        </w:rPr>
+        <w:t xml:space="preserve"> Basic Input Gradients</w:t>
       </w:r>
     </w:p>
     <w:p>
@@ -2204,10 +2262,20 @@
       <w:r>
         <w:rPr>
           <w:rFonts w:eastAsiaTheme="minorEastAsia"/>
-          <w:sz w:val="26"/>
-          <w:szCs w:val="26"/>
-        </w:rPr>
-        <w:t xml:space="preserve">Example 2: With </w:t>
+          <w:b/>
+          <w:bCs/>
+          <w:sz w:val="26"/>
+          <w:szCs w:val="26"/>
+        </w:rPr>
+        <w:t xml:space="preserve">Example 2: </w:t>
+      </w:r>
+      <w:r>
+        <w:rPr>
+          <w:rFonts w:eastAsiaTheme="minorEastAsia"/>
+          <w:sz w:val="26"/>
+          <w:szCs w:val="26"/>
+        </w:rPr>
+        <w:t xml:space="preserve">With </w:t>
       </w:r>
       <w:proofErr w:type="spellStart"/>
       <w:r>
@@ -2770,10 +2838,20 @@
       <w:r>
         <w:rPr>
           <w:rFonts w:eastAsiaTheme="minorEastAsia"/>
-          <w:sz w:val="26"/>
-          <w:szCs w:val="26"/>
-        </w:rPr>
-        <w:t xml:space="preserve">Example 3: </w:t>
+          <w:b/>
+          <w:bCs/>
+          <w:sz w:val="26"/>
+          <w:szCs w:val="26"/>
+        </w:rPr>
+        <w:t>Example 3:</w:t>
+      </w:r>
+      <w:r>
+        <w:rPr>
+          <w:rFonts w:eastAsiaTheme="minorEastAsia"/>
+          <w:sz w:val="26"/>
+          <w:szCs w:val="26"/>
+        </w:rPr>
+        <w:t xml:space="preserve"> </w:t>
       </w:r>
       <w:proofErr w:type="spellStart"/>
       <w:r>

</xml_diff>

<commit_message>
Second Version of Study Notes that adds papers that discuss the origins of Saliency
</commit_message>
<xml_diff>
--- a/Study Notes.docx
+++ b/Study Notes.docx
@@ -30,298 +30,999 @@
     <w:p>
       <w:pPr>
         <w:rPr>
-          <w:sz w:val="26"/>
-          <w:szCs w:val="26"/>
-        </w:rPr>
-      </w:pPr>
-      <w:r>
-        <w:rPr>
-          <w:sz w:val="26"/>
-          <w:szCs w:val="26"/>
-        </w:rPr>
-        <w:t>To be able to understand what parts of an image influence the decision of a neural network, concepts such as input gradients and saliency maps are used. These techniques act like a window into the AI’s black box logic, helping us see which pixels it attended to when making predictions.</w:t>
-      </w:r>
-    </w:p>
-    <w:p>
-      <w:pPr>
-        <w:rPr>
-          <w:sz w:val="26"/>
-          <w:szCs w:val="26"/>
-        </w:rPr>
-      </w:pPr>
-      <w:r>
-        <w:rPr>
-          <w:sz w:val="26"/>
-          <w:szCs w:val="26"/>
-        </w:rPr>
-        <w:t>In simple terms, an input gradient measures how much a tiny change in a specific pixel would change the network’s final confidence score. Imagine you are standing in front of a giant wall consisting of tiny dimmer switches, where each switch represents a pixel in an image. Somewhere else, there is a meter showing how confident the computer is deducing that the image is a cat. An input gradient is when you ask the question: “If I slowly push this tiny switch, how much will that Cat needle move?”</w:t>
-      </w:r>
-    </w:p>
-    <w:p>
-      <w:pPr>
-        <w:rPr>
-          <w:sz w:val="26"/>
-          <w:szCs w:val="26"/>
-        </w:rPr>
-      </w:pPr>
-      <w:r>
-        <w:rPr>
-          <w:sz w:val="26"/>
-          <w:szCs w:val="26"/>
-        </w:rPr>
-        <w:t xml:space="preserve">If moving a pixel's value (its brightness or </w:t>
-      </w:r>
-      <w:proofErr w:type="spellStart"/>
-      <w:r>
-        <w:rPr>
-          <w:sz w:val="26"/>
-          <w:szCs w:val="26"/>
-        </w:rPr>
-        <w:t>color</w:t>
-      </w:r>
-      <w:proofErr w:type="spellEnd"/>
-      <w:r>
-        <w:rPr>
-          <w:sz w:val="26"/>
-          <w:szCs w:val="26"/>
-        </w:rPr>
-        <w:t>) makes the "Cat" score jump significantly</w:t>
-      </w:r>
-      <w:r>
-        <w:rPr>
-          <w:sz w:val="26"/>
-          <w:szCs w:val="26"/>
-        </w:rPr>
-        <w:t>, the network would be highly sensitive towards that pixel. If moving the pixel does nothing, then the network is simply ignoring that pixel.</w:t>
-      </w:r>
-    </w:p>
-    <w:p>
-      <w:pPr>
-        <w:rPr>
-          <w:sz w:val="26"/>
-          <w:szCs w:val="26"/>
-        </w:rPr>
-      </w:pPr>
-      <w:r>
-        <w:rPr>
-          <w:sz w:val="26"/>
-          <w:szCs w:val="26"/>
-        </w:rPr>
-        <w:t xml:space="preserve">A saliency map (also known as a sensitivity or pixel attribution map) is the </w:t>
-      </w:r>
-      <w:r>
-        <w:rPr>
-          <w:sz w:val="26"/>
-          <w:szCs w:val="26"/>
-        </w:rPr>
-        <w:t xml:space="preserve">result of gathering all of the tiny “nudges” and displaying them as a single image. Think of a saliency map as a heat-sensing camera for the AI’s brain. When the AI looks at a picture of a gazelle, the saliency maps highlight the important areas of the gazelle such as the horns and the ears. Through these hot spots, the AI can deduce that the image can be labelled as an image representing a gazelle. A saliency map can turn the mathematical importance of each pixel into a visual guide that humans can understand. For instance, </w:t>
-      </w:r>
-      <w:r>
-        <w:rPr>
-          <w:sz w:val="26"/>
-          <w:szCs w:val="26"/>
-        </w:rPr>
-        <w:t xml:space="preserve">if you see high "heat" on a gazelle's body but none on the grass behind it, you know </w:t>
-      </w:r>
-      <w:r>
-        <w:rPr>
-          <w:sz w:val="26"/>
-          <w:szCs w:val="26"/>
-        </w:rPr>
-        <w:t xml:space="preserve">that </w:t>
-      </w:r>
-      <w:r>
-        <w:rPr>
-          <w:sz w:val="26"/>
-          <w:szCs w:val="26"/>
-        </w:rPr>
-        <w:t>the model is focused on the correct object rather than random background clues</w:t>
-      </w:r>
-      <w:r>
-        <w:rPr>
-          <w:sz w:val="26"/>
-          <w:szCs w:val="26"/>
-        </w:rPr>
-        <w:t>.</w:t>
-      </w:r>
-    </w:p>
-    <w:p>
-      <w:pPr>
-        <w:rPr>
-          <w:sz w:val="26"/>
-          <w:szCs w:val="26"/>
-        </w:rPr>
-      </w:pPr>
-      <w:r>
-        <w:rPr>
-          <w:sz w:val="26"/>
-          <w:szCs w:val="26"/>
-        </w:rPr>
-        <w:t xml:space="preserve">One problem that is common with basic gradients is the fact that these gradients are susceptible to noise where the gradients highlight </w:t>
-      </w:r>
-      <w:r>
-        <w:rPr>
-          <w:sz w:val="26"/>
-          <w:szCs w:val="26"/>
-        </w:rPr>
-        <w:t>random pixels that don't seem important to a human eye</w:t>
-      </w:r>
-      <w:r>
-        <w:rPr>
-          <w:sz w:val="26"/>
-          <w:szCs w:val="26"/>
-        </w:rPr>
-        <w:t xml:space="preserve">. It is like looking at a map through a cracked and blurry lens. </w:t>
-      </w:r>
-      <w:r>
-        <w:rPr>
-          <w:sz w:val="26"/>
-          <w:szCs w:val="26"/>
-        </w:rPr>
-        <w:t>You can see the general shape of the "hot spots," but there are random speckles everywhere</w:t>
-      </w:r>
-      <w:r>
-        <w:rPr>
-          <w:sz w:val="26"/>
-          <w:szCs w:val="26"/>
-        </w:rPr>
-        <w:t xml:space="preserve">. To solve this problem, methods such as </w:t>
-      </w:r>
-      <w:proofErr w:type="spellStart"/>
-      <w:r>
-        <w:rPr>
-          <w:sz w:val="26"/>
-          <w:szCs w:val="26"/>
-        </w:rPr>
-        <w:t>SmoothGrad</w:t>
-      </w:r>
-      <w:proofErr w:type="spellEnd"/>
-      <w:r>
-        <w:rPr>
-          <w:sz w:val="26"/>
-          <w:szCs w:val="26"/>
-        </w:rPr>
-        <w:t xml:space="preserve"> can be implemented. This technique would take slightly different versions of the image by adding a bit of static or noise to each image. The gradients for all of the images are then calculated </w:t>
-      </w:r>
-      <w:r>
-        <w:rPr>
-          <w:sz w:val="26"/>
-          <w:szCs w:val="26"/>
-        </w:rPr>
-        <w:t xml:space="preserve">and then averaged out. This </w:t>
-      </w:r>
-      <w:r>
-        <w:rPr>
-          <w:sz w:val="26"/>
-          <w:szCs w:val="26"/>
-        </w:rPr>
-        <w:lastRenderedPageBreak/>
-        <w:t xml:space="preserve">technique is similar to </w:t>
-      </w:r>
-      <w:r>
-        <w:rPr>
-          <w:sz w:val="26"/>
-          <w:szCs w:val="26"/>
-        </w:rPr>
-        <w:t>taking 50 blurry photos of the same scene and layering them to get one sharp, clear picture</w:t>
-      </w:r>
-      <w:r>
-        <w:rPr>
-          <w:sz w:val="26"/>
-          <w:szCs w:val="26"/>
-        </w:rPr>
-        <w:t>.</w:t>
-      </w:r>
-    </w:p>
-    <w:p>
-      <w:pPr>
-        <w:rPr>
-          <w:sz w:val="26"/>
-          <w:szCs w:val="26"/>
-        </w:rPr>
-      </w:pPr>
-      <w:r>
-        <w:rPr>
-          <w:sz w:val="26"/>
-          <w:szCs w:val="26"/>
-        </w:rPr>
-        <w:t xml:space="preserve">Saliency Maps and Input Gradients are important for a network’s decision making as it can help developers debug models. For example, if a self-driving car </w:t>
-      </w:r>
-      <w:r>
-        <w:rPr>
-          <w:sz w:val="26"/>
-          <w:szCs w:val="26"/>
-        </w:rPr>
-        <w:t>fails to brake for a fire</w:t>
-      </w:r>
-      <w:r>
-        <w:rPr>
-          <w:sz w:val="26"/>
-          <w:szCs w:val="26"/>
-        </w:rPr>
-        <w:t xml:space="preserve"> </w:t>
-      </w:r>
-      <w:r>
-        <w:rPr>
-          <w:sz w:val="26"/>
-          <w:szCs w:val="26"/>
-        </w:rPr>
-        <w:t>truck, a saliency map could reveal if the AI was actually "looking" at the truck or was distracted by a bright sign on the side of the road</w:t>
-      </w:r>
-      <w:r>
-        <w:rPr>
-          <w:sz w:val="26"/>
-          <w:szCs w:val="26"/>
-        </w:rPr>
-        <w:t>. By identifying the pixels that carry the most weight, we can make sure that the model is learning the correct rules instead of finding shortcuts.</w:t>
-      </w:r>
-    </w:p>
-    <w:p>
-      <w:pPr>
-        <w:rPr>
-          <w:sz w:val="26"/>
-          <w:szCs w:val="26"/>
-        </w:rPr>
-      </w:pPr>
-      <w:r>
-        <w:rPr>
-          <w:sz w:val="26"/>
-          <w:szCs w:val="26"/>
-        </w:rPr>
-        <w:t xml:space="preserve">There are various </w:t>
-      </w:r>
-      <w:r>
-        <w:rPr>
           <w:b/>
           <w:bCs/>
           <w:sz w:val="26"/>
           <w:szCs w:val="26"/>
-        </w:rPr>
-        <w:t>mathematical formulations</w:t>
-      </w:r>
-      <w:r>
-        <w:rPr>
-          <w:sz w:val="26"/>
-          <w:szCs w:val="26"/>
-        </w:rPr>
-        <w:t xml:space="preserve"> that are used:</w:t>
-      </w:r>
-    </w:p>
-    <w:p>
-      <w:pPr>
+          <w:u w:val="single"/>
+        </w:rPr>
+      </w:pPr>
+      <w:r>
         <w:rPr>
           <w:b/>
           <w:bCs/>
           <w:sz w:val="26"/>
           <w:szCs w:val="26"/>
-        </w:rPr>
-      </w:pPr>
-      <w:r>
+          <w:u w:val="single"/>
+        </w:rPr>
+        <w:t>Introduction</w:t>
+      </w:r>
+    </w:p>
+    <w:p>
+      <w:pPr>
+        <w:rPr>
+          <w:sz w:val="26"/>
+          <w:szCs w:val="26"/>
+        </w:rPr>
+      </w:pPr>
+      <w:r>
+        <w:rPr>
+          <w:sz w:val="26"/>
+          <w:szCs w:val="26"/>
+        </w:rPr>
+        <w:t xml:space="preserve">To be able to understand what parts of an image influence the decision of a neural network, </w:t>
+      </w:r>
+      <w:r>
+        <w:rPr>
+          <w:sz w:val="26"/>
+          <w:szCs w:val="26"/>
+        </w:rPr>
+        <w:t>technique</w:t>
+      </w:r>
+      <w:r>
+        <w:rPr>
+          <w:sz w:val="26"/>
+          <w:szCs w:val="26"/>
+        </w:rPr>
+        <w:t xml:space="preserve">s such as input gradients and saliency maps are used. These </w:t>
+      </w:r>
+      <w:r>
+        <w:rPr>
+          <w:sz w:val="26"/>
+          <w:szCs w:val="26"/>
+        </w:rPr>
+        <w:t>methods</w:t>
+      </w:r>
+      <w:r>
+        <w:rPr>
+          <w:sz w:val="26"/>
+          <w:szCs w:val="26"/>
+        </w:rPr>
+        <w:t xml:space="preserve"> act </w:t>
+      </w:r>
+      <w:r>
+        <w:rPr>
+          <w:sz w:val="26"/>
+          <w:szCs w:val="26"/>
+        </w:rPr>
+        <w:t>as</w:t>
+      </w:r>
+      <w:r>
+        <w:rPr>
+          <w:sz w:val="26"/>
+          <w:szCs w:val="26"/>
+        </w:rPr>
+        <w:t xml:space="preserve"> a window into the </w:t>
+      </w:r>
+      <w:r>
+        <w:rPr>
+          <w:sz w:val="26"/>
+          <w:szCs w:val="26"/>
+        </w:rPr>
+        <w:t>model</w:t>
+      </w:r>
+      <w:r>
+        <w:rPr>
+          <w:sz w:val="26"/>
+          <w:szCs w:val="26"/>
+        </w:rPr>
+        <w:t>’s black box logic, helping us see which pixels it attended to when making predictions.</w:t>
+      </w:r>
+      <w:r>
+        <w:rPr>
+          <w:sz w:val="26"/>
+          <w:szCs w:val="26"/>
+        </w:rPr>
+        <w:t xml:space="preserve"> </w:t>
+      </w:r>
+      <w:r>
+        <w:rPr>
+          <w:sz w:val="26"/>
+          <w:szCs w:val="26"/>
+        </w:rPr>
+        <w:t>Deep neural networks, especially those in the field of computer vision, have achieved very strong performances in tasks such as image classification, object detection and medical diagnosis</w:t>
+      </w:r>
+      <w:r>
+        <w:rPr>
+          <w:sz w:val="26"/>
+          <w:szCs w:val="26"/>
+        </w:rPr>
+        <w:t xml:space="preserve">. However, despite their accuracy these models are </w:t>
+      </w:r>
+      <w:r>
+        <w:rPr>
+          <w:sz w:val="26"/>
+          <w:szCs w:val="26"/>
+        </w:rPr>
+        <w:t>often difficult to interpret due to their complex and highly non-linear structure.</w:t>
+      </w:r>
+      <w:r>
+        <w:rPr>
+          <w:sz w:val="26"/>
+          <w:szCs w:val="26"/>
+        </w:rPr>
+        <w:t xml:space="preserve"> This raises problems, especially in domains where</w:t>
+      </w:r>
+      <w:r>
+        <w:t xml:space="preserve"> </w:t>
+      </w:r>
+      <w:r>
+        <w:rPr>
+          <w:sz w:val="26"/>
+          <w:szCs w:val="26"/>
+        </w:rPr>
+        <w:t>understanding why</w:t>
+      </w:r>
+      <w:r>
+        <w:rPr>
+          <w:sz w:val="26"/>
+          <w:szCs w:val="26"/>
+        </w:rPr>
+        <w:t xml:space="preserve"> </w:t>
+      </w:r>
+      <w:r>
+        <w:rPr>
+          <w:sz w:val="26"/>
+          <w:szCs w:val="26"/>
+        </w:rPr>
+        <w:t xml:space="preserve">a model </w:t>
+      </w:r>
+      <w:proofErr w:type="gramStart"/>
+      <w:r>
+        <w:rPr>
+          <w:sz w:val="26"/>
+          <w:szCs w:val="26"/>
+        </w:rPr>
+        <w:t>made a decision</w:t>
+      </w:r>
+      <w:proofErr w:type="gramEnd"/>
+      <w:r>
+        <w:rPr>
+          <w:sz w:val="26"/>
+          <w:szCs w:val="26"/>
+        </w:rPr>
+        <w:t xml:space="preserve"> is just as important as the decision itself.</w:t>
+      </w:r>
+    </w:p>
+    <w:p>
+      <w:pPr>
+        <w:rPr>
+          <w:sz w:val="26"/>
+          <w:szCs w:val="26"/>
+        </w:rPr>
+      </w:pPr>
+      <w:r>
+        <w:rPr>
+          <w:sz w:val="26"/>
+          <w:szCs w:val="26"/>
+        </w:rPr>
+        <w:t xml:space="preserve">Saliency-based interpretability methods aim to address this problem by </w:t>
+      </w:r>
+      <w:r>
+        <w:rPr>
+          <w:sz w:val="26"/>
+          <w:szCs w:val="26"/>
+        </w:rPr>
+        <w:t xml:space="preserve">providing visual explanations </w:t>
+      </w:r>
+      <w:r>
+        <w:rPr>
+          <w:sz w:val="26"/>
+          <w:szCs w:val="26"/>
+        </w:rPr>
+        <w:t xml:space="preserve">for the behaviour of the </w:t>
+      </w:r>
+      <w:r>
+        <w:rPr>
+          <w:sz w:val="26"/>
+          <w:szCs w:val="26"/>
+        </w:rPr>
+        <w:t>model</w:t>
+      </w:r>
+      <w:r>
+        <w:rPr>
+          <w:sz w:val="26"/>
+          <w:szCs w:val="26"/>
+        </w:rPr>
+        <w:t xml:space="preserve">. By analysing the relationship between the small changes in the input pixels and the output, these techniques can estimate the </w:t>
+      </w:r>
+      <w:r>
+        <w:rPr>
+          <w:sz w:val="26"/>
+          <w:szCs w:val="26"/>
+        </w:rPr>
+        <w:t>importance of each pixel and present it in the form of a saliency map.</w:t>
+      </w:r>
+      <w:r>
+        <w:rPr>
+          <w:sz w:val="26"/>
+          <w:szCs w:val="26"/>
+        </w:rPr>
+        <w:t xml:space="preserve"> This allows us to identify which regions of an image </w:t>
+      </w:r>
+      <w:r>
+        <w:rPr>
+          <w:sz w:val="26"/>
+          <w:szCs w:val="26"/>
+        </w:rPr>
+        <w:t>the model is focusing on when making predictions.</w:t>
+      </w:r>
+    </w:p>
+    <w:p>
+      <w:r>
+        <w:rPr>
+          <w:sz w:val="26"/>
+          <w:szCs w:val="26"/>
+        </w:rPr>
+        <w:t xml:space="preserve">The concept of saliency began from </w:t>
+      </w:r>
+      <w:r>
+        <w:rPr>
+          <w:sz w:val="26"/>
+          <w:szCs w:val="26"/>
+        </w:rPr>
+        <w:t>studies of human visual perception</w:t>
+      </w:r>
+      <w:r>
+        <w:rPr>
+          <w:sz w:val="26"/>
+          <w:szCs w:val="26"/>
+        </w:rPr>
+        <w:t>, where certain regions of a scene naturally stand out due to contrast or distinct</w:t>
+      </w:r>
+      <w:r>
+        <w:rPr>
+          <w:sz w:val="26"/>
+          <w:szCs w:val="26"/>
+        </w:rPr>
+        <w:t xml:space="preserve"> features. </w:t>
+      </w:r>
+      <w:r>
+        <w:rPr>
+          <w:sz w:val="26"/>
+          <w:szCs w:val="26"/>
+        </w:rPr>
+        <w:t>Early computational models of visual attention, such as those proposed by</w:t>
+      </w:r>
+      <w:r>
+        <w:rPr>
+          <w:sz w:val="26"/>
+          <w:szCs w:val="26"/>
+        </w:rPr>
+        <w:t xml:space="preserve"> </w:t>
+      </w:r>
+      <w:proofErr w:type="spellStart"/>
+      <w:r>
+        <w:rPr>
+          <w:sz w:val="26"/>
+          <w:szCs w:val="26"/>
+        </w:rPr>
+        <w:t>Itti</w:t>
+      </w:r>
+      <w:proofErr w:type="spellEnd"/>
+      <w:r>
+        <w:rPr>
+          <w:sz w:val="26"/>
+          <w:szCs w:val="26"/>
+        </w:rPr>
+        <w:t xml:space="preserve"> et. al, found this idea by </w:t>
+      </w:r>
+      <w:r>
+        <w:rPr>
+          <w:sz w:val="26"/>
+          <w:szCs w:val="26"/>
+        </w:rPr>
+        <w:t>simulating how the human visual system prioritises information.</w:t>
+      </w:r>
+      <w:r>
+        <w:rPr>
+          <w:sz w:val="26"/>
+          <w:szCs w:val="26"/>
+        </w:rPr>
+        <w:t xml:space="preserve"> While these approaches rely on </w:t>
+      </w:r>
+      <w:r>
+        <w:rPr>
+          <w:sz w:val="26"/>
+          <w:szCs w:val="26"/>
+        </w:rPr>
+        <w:t>hand-crafted features</w:t>
+      </w:r>
+      <w:r>
+        <w:rPr>
+          <w:sz w:val="26"/>
+          <w:szCs w:val="26"/>
+        </w:rPr>
+        <w:t xml:space="preserve">, modern deep learning saliency methods </w:t>
+      </w:r>
+      <w:r>
+        <w:rPr>
+          <w:sz w:val="26"/>
+          <w:szCs w:val="26"/>
+        </w:rPr>
+        <w:t>derive importance directly from the model using gradient-based techniques</w:t>
+      </w:r>
+      <w:r>
+        <w:rPr>
+          <w:sz w:val="26"/>
+          <w:szCs w:val="26"/>
+        </w:rPr>
+        <w:t xml:space="preserve">. In this topic, we explore </w:t>
+      </w:r>
+      <w:r>
+        <w:rPr>
+          <w:sz w:val="26"/>
+          <w:szCs w:val="26"/>
+        </w:rPr>
+        <w:t xml:space="preserve">input-space interpretability methods, focusing on input gradients, vanilla saliency maps, guided backpropagation, and </w:t>
+      </w:r>
+      <w:proofErr w:type="spellStart"/>
+      <w:r>
+        <w:rPr>
+          <w:sz w:val="26"/>
+          <w:szCs w:val="26"/>
+        </w:rPr>
+        <w:t>SmoothGrad</w:t>
+      </w:r>
+      <w:proofErr w:type="spellEnd"/>
+      <w:r>
+        <w:rPr>
+          <w:sz w:val="26"/>
+          <w:szCs w:val="26"/>
+        </w:rPr>
+        <w:t>. We examine how these techniques work, their strengths and limitations, and how they can be used to better understand the decision-making process of neural networks.</w:t>
+      </w:r>
+    </w:p>
+    <w:p>
+      <w:pPr>
         <w:rPr>
           <w:b/>
           <w:bCs/>
           <w:sz w:val="26"/>
           <w:szCs w:val="26"/>
+          <w:u w:val="single"/>
+        </w:rPr>
+      </w:pPr>
+      <w:r>
+        <w:rPr>
+          <w:b/>
+          <w:bCs/>
+          <w:sz w:val="26"/>
+          <w:szCs w:val="26"/>
+          <w:u w:val="single"/>
+        </w:rPr>
+        <w:t>Biological Foundations</w:t>
+      </w:r>
+    </w:p>
+    <w:p>
+      <w:pPr>
+        <w:rPr>
+          <w:sz w:val="26"/>
+          <w:szCs w:val="26"/>
+        </w:rPr>
+      </w:pPr>
+      <w:r>
+        <w:rPr>
+          <w:sz w:val="26"/>
+          <w:szCs w:val="26"/>
+        </w:rPr>
+        <w:t xml:space="preserve">Saliency refers to the property of an object that makes it stand out relative to its surroundings. </w:t>
+      </w:r>
+      <w:r>
+        <w:rPr>
+          <w:sz w:val="26"/>
+          <w:szCs w:val="26"/>
+        </w:rPr>
+        <w:t xml:space="preserve">This concept originates from </w:t>
+      </w:r>
+      <w:r>
+        <w:rPr>
+          <w:sz w:val="26"/>
+          <w:szCs w:val="26"/>
+        </w:rPr>
+        <w:t xml:space="preserve">studies of human visual attention. The human visual system must process large amounts of information </w:t>
+      </w:r>
+      <w:r>
+        <w:rPr>
+          <w:sz w:val="26"/>
+          <w:szCs w:val="26"/>
+        </w:rPr>
+        <w:t xml:space="preserve">efficiently </w:t>
+      </w:r>
+      <w:r>
+        <w:rPr>
+          <w:sz w:val="26"/>
+          <w:szCs w:val="26"/>
+        </w:rPr>
+        <w:lastRenderedPageBreak/>
+        <w:t>and</w:t>
+      </w:r>
+      <w:r>
+        <w:rPr>
+          <w:sz w:val="26"/>
+          <w:szCs w:val="26"/>
+        </w:rPr>
+        <w:t xml:space="preserve"> therefore relies on a bottom-up mechanism that rapidly highlights visually distinctive regions for further analysis.</w:t>
+      </w:r>
+      <w:r>
+        <w:rPr>
+          <w:sz w:val="26"/>
+          <w:szCs w:val="26"/>
+        </w:rPr>
+        <w:t xml:space="preserve"> </w:t>
+      </w:r>
+    </w:p>
+    <w:p>
+      <w:pPr>
+        <w:rPr>
+          <w:sz w:val="26"/>
+          <w:szCs w:val="26"/>
+        </w:rPr>
+      </w:pPr>
+      <w:r>
+        <w:rPr>
+          <w:sz w:val="26"/>
+          <w:szCs w:val="26"/>
+        </w:rPr>
+        <w:t xml:space="preserve">A </w:t>
+      </w:r>
+      <w:r>
+        <w:rPr>
+          <w:sz w:val="26"/>
+          <w:szCs w:val="26"/>
+        </w:rPr>
+        <w:t>classic</w:t>
+      </w:r>
+      <w:r>
+        <w:rPr>
+          <w:sz w:val="26"/>
+          <w:szCs w:val="26"/>
+        </w:rPr>
+        <w:t xml:space="preserve"> example of this </w:t>
+      </w:r>
+      <w:r>
+        <w:rPr>
+          <w:sz w:val="26"/>
+          <w:szCs w:val="26"/>
+        </w:rPr>
+        <w:t xml:space="preserve">process </w:t>
+      </w:r>
+      <w:r>
+        <w:rPr>
+          <w:sz w:val="26"/>
+          <w:szCs w:val="26"/>
+        </w:rPr>
+        <w:t xml:space="preserve">can be found in the papers by </w:t>
+      </w:r>
+      <w:proofErr w:type="spellStart"/>
+      <w:r>
+        <w:rPr>
+          <w:sz w:val="26"/>
+          <w:szCs w:val="26"/>
+        </w:rPr>
+        <w:t>Itti</w:t>
+      </w:r>
+      <w:proofErr w:type="spellEnd"/>
+      <w:r>
+        <w:rPr>
+          <w:sz w:val="26"/>
+          <w:szCs w:val="26"/>
+        </w:rPr>
+        <w:t xml:space="preserve"> et. al. In these papers, </w:t>
+      </w:r>
+      <w:proofErr w:type="spellStart"/>
+      <w:r>
+        <w:rPr>
+          <w:sz w:val="26"/>
+          <w:szCs w:val="26"/>
+        </w:rPr>
+        <w:t>Itti</w:t>
+      </w:r>
+      <w:proofErr w:type="spellEnd"/>
+      <w:r>
+        <w:rPr>
+          <w:sz w:val="26"/>
+          <w:szCs w:val="26"/>
+        </w:rPr>
+        <w:t xml:space="preserve"> et al. define saliency using a pre-attentive, bottom-up approach that was designed to simulate how the primate visual system handles information bottlenecks by rapidly selecting conspicuous locations for detailed analysis.</w:t>
+      </w:r>
+      <w:r>
+        <w:rPr>
+          <w:sz w:val="26"/>
+          <w:szCs w:val="26"/>
+        </w:rPr>
+        <w:t xml:space="preserve"> </w:t>
+      </w:r>
+      <w:r>
+        <w:rPr>
+          <w:sz w:val="26"/>
+          <w:szCs w:val="26"/>
+        </w:rPr>
+        <w:t xml:space="preserve">An image is </w:t>
+      </w:r>
+      <w:r>
+        <w:rPr>
+          <w:sz w:val="26"/>
+          <w:szCs w:val="26"/>
+        </w:rPr>
+        <w:t>decomposed into multiple feature channels, including intensity, colour, and orientation. These features are analysed at different spatial scales to capture both fine and coarse visual structures. The model computes centre-surround contrasts, which measure how different a region is compared to its surroundings, producing feature maps that highlight areas of high visual contrast.</w:t>
+      </w:r>
+      <w:r>
+        <w:rPr>
+          <w:sz w:val="26"/>
+          <w:szCs w:val="26"/>
+        </w:rPr>
+        <w:t xml:space="preserve"> These feature maps are then combined into a single saliency map</w:t>
+      </w:r>
+      <w:r>
+        <w:rPr>
+          <w:sz w:val="26"/>
+          <w:szCs w:val="26"/>
+        </w:rPr>
+        <w:t>, where higher values correspond to regions that are more visually prominent.</w:t>
+      </w:r>
+      <w:r>
+        <w:rPr>
+          <w:sz w:val="26"/>
+          <w:szCs w:val="26"/>
+        </w:rPr>
+        <w:t xml:space="preserve"> </w:t>
+      </w:r>
+      <w:r>
+        <w:rPr>
+          <w:sz w:val="26"/>
+          <w:szCs w:val="26"/>
+        </w:rPr>
+        <w:t xml:space="preserve">This map indicates where </w:t>
+      </w:r>
+      <w:r>
+        <w:rPr>
+          <w:sz w:val="26"/>
+          <w:szCs w:val="26"/>
+        </w:rPr>
+        <w:t>the visual system should focus next, simulating both rapid detection and sequential attention shifts.</w:t>
+      </w:r>
+      <w:r>
+        <w:rPr>
+          <w:sz w:val="26"/>
+          <w:szCs w:val="26"/>
+        </w:rPr>
+        <w:t xml:space="preserve"> </w:t>
+      </w:r>
+    </w:p>
+    <w:p>
+      <w:pPr>
+        <w:rPr>
+          <w:sz w:val="26"/>
+          <w:szCs w:val="26"/>
+        </w:rPr>
+      </w:pPr>
+      <w:r>
+        <w:rPr>
+          <w:sz w:val="26"/>
+          <w:szCs w:val="26"/>
+        </w:rPr>
+        <w:t>However, w</w:t>
+      </w:r>
+      <w:r>
+        <w:rPr>
+          <w:sz w:val="26"/>
+          <w:szCs w:val="26"/>
+        </w:rPr>
+        <w:t xml:space="preserve">hen </w:t>
+      </w:r>
+      <w:r>
+        <w:rPr>
+          <w:sz w:val="26"/>
+          <w:szCs w:val="26"/>
+        </w:rPr>
+        <w:t xml:space="preserve">deep </w:t>
+      </w:r>
+      <w:r>
+        <w:rPr>
+          <w:sz w:val="26"/>
+          <w:szCs w:val="26"/>
+        </w:rPr>
+        <w:t xml:space="preserve">neural networks were introduced, the classical saliency method could not be directly applied to such networks. This was because these methods were designed to </w:t>
+      </w:r>
+      <w:r>
+        <w:rPr>
+          <w:sz w:val="26"/>
+          <w:szCs w:val="26"/>
+        </w:rPr>
+        <w:t>detect low-level features</w:t>
+      </w:r>
+      <w:r>
+        <w:rPr>
+          <w:sz w:val="26"/>
+          <w:szCs w:val="26"/>
+        </w:rPr>
+        <w:t xml:space="preserve"> such as edges and textures that human eyes perceive. To combat this, deep learning saliency techniques were employed. These are </w:t>
+      </w:r>
+      <w:r>
+        <w:rPr>
+          <w:sz w:val="26"/>
+          <w:szCs w:val="26"/>
+        </w:rPr>
+        <w:t>post-hoc interpretability tool</w:t>
+      </w:r>
+      <w:r>
+        <w:rPr>
+          <w:sz w:val="26"/>
+          <w:szCs w:val="26"/>
+        </w:rPr>
+        <w:t>s</w:t>
+      </w:r>
+      <w:r>
+        <w:rPr>
+          <w:sz w:val="26"/>
+          <w:szCs w:val="26"/>
+        </w:rPr>
+        <w:t xml:space="preserve"> (attribution method</w:t>
+      </w:r>
+      <w:r>
+        <w:rPr>
+          <w:sz w:val="26"/>
+          <w:szCs w:val="26"/>
+        </w:rPr>
+        <w:t>s</w:t>
+      </w:r>
+      <w:r>
+        <w:rPr>
+          <w:sz w:val="26"/>
+          <w:szCs w:val="26"/>
+        </w:rPr>
+        <w:t>)</w:t>
+      </w:r>
+      <w:r>
+        <w:rPr>
+          <w:sz w:val="26"/>
+          <w:szCs w:val="26"/>
+        </w:rPr>
+        <w:t xml:space="preserve"> that are</w:t>
+      </w:r>
+      <w:r>
+        <w:rPr>
+          <w:sz w:val="26"/>
+          <w:szCs w:val="26"/>
+        </w:rPr>
+        <w:t xml:space="preserve"> used to identify which input features (pixels) </w:t>
+      </w:r>
+      <w:r>
+        <w:rPr>
+          <w:sz w:val="26"/>
+          <w:szCs w:val="26"/>
+        </w:rPr>
+        <w:t xml:space="preserve">massively </w:t>
+      </w:r>
+      <w:r>
+        <w:rPr>
+          <w:sz w:val="26"/>
+          <w:szCs w:val="26"/>
+        </w:rPr>
+        <w:t>influenced a neural network's final classification score</w:t>
+      </w:r>
+      <w:r>
+        <w:rPr>
+          <w:sz w:val="26"/>
+          <w:szCs w:val="26"/>
+        </w:rPr>
+        <w:t>.</w:t>
+      </w:r>
+    </w:p>
+    <w:p>
+      <w:pPr>
+        <w:rPr>
+          <w:b/>
+          <w:bCs/>
+          <w:sz w:val="26"/>
+          <w:szCs w:val="26"/>
+          <w:u w:val="single"/>
+        </w:rPr>
+      </w:pPr>
+      <w:r>
+        <w:rPr>
+          <w:b/>
+          <w:bCs/>
+          <w:sz w:val="26"/>
+          <w:szCs w:val="26"/>
+          <w:u w:val="single"/>
+        </w:rPr>
+        <w:t>Input Gradients</w:t>
+      </w:r>
+    </w:p>
+    <w:p>
+      <w:pPr>
+        <w:rPr>
+          <w:sz w:val="26"/>
+          <w:szCs w:val="26"/>
+        </w:rPr>
+      </w:pPr>
+      <w:r>
+        <w:rPr>
+          <w:sz w:val="26"/>
+          <w:szCs w:val="26"/>
+        </w:rPr>
+        <w:t>In simple terms, an input gradient measures how much a tiny change in a specific pixel would change the network’s final confidence score. Imagine you are standing in front of a giant wall consisting of tiny dimmer switches, where each switch represents a pixel in an image. Somewhere else, there is a meter showing how confident the computer is deducing that the image is a cat. An input gradient is when you ask the question: “If I slowly push this tiny switch, how much will that Cat needle move?”</w:t>
+      </w:r>
+    </w:p>
+    <w:p>
+      <w:pPr>
+        <w:rPr>
+          <w:sz w:val="26"/>
+          <w:szCs w:val="26"/>
+        </w:rPr>
+      </w:pPr>
+      <w:r>
+        <w:rPr>
+          <w:sz w:val="26"/>
+          <w:szCs w:val="26"/>
+        </w:rPr>
+        <w:t xml:space="preserve">If moving a pixel's value (its brightness or </w:t>
+      </w:r>
+      <w:proofErr w:type="spellStart"/>
+      <w:r>
+        <w:rPr>
+          <w:sz w:val="26"/>
+          <w:szCs w:val="26"/>
+        </w:rPr>
+        <w:t>color</w:t>
+      </w:r>
+      <w:proofErr w:type="spellEnd"/>
+      <w:r>
+        <w:rPr>
+          <w:sz w:val="26"/>
+          <w:szCs w:val="26"/>
+        </w:rPr>
+        <w:t>) makes the "Cat" score jump significantly</w:t>
+      </w:r>
+      <w:r>
+        <w:rPr>
+          <w:sz w:val="26"/>
+          <w:szCs w:val="26"/>
+        </w:rPr>
+        <w:t>, the network would be highly sensitive towards that pixel. If moving the pixel does nothing, then the network is simply ignoring that pixel.</w:t>
+      </w:r>
+    </w:p>
+    <w:p>
+      <w:pPr>
+        <w:rPr>
+          <w:sz w:val="26"/>
+          <w:szCs w:val="26"/>
+        </w:rPr>
+      </w:pPr>
+      <w:r>
+        <w:rPr>
+          <w:sz w:val="26"/>
+          <w:szCs w:val="26"/>
+        </w:rPr>
+        <w:t xml:space="preserve">A saliency map (also known as a sensitivity or pixel attribution map) is the </w:t>
+      </w:r>
+      <w:r>
+        <w:rPr>
+          <w:sz w:val="26"/>
+          <w:szCs w:val="26"/>
+        </w:rPr>
+        <w:t xml:space="preserve">result of gathering all of the tiny “nudges” and displaying them as a single image. Think </w:t>
+      </w:r>
+      <w:r>
+        <w:rPr>
+          <w:sz w:val="26"/>
+          <w:szCs w:val="26"/>
+        </w:rPr>
+        <w:lastRenderedPageBreak/>
+        <w:t xml:space="preserve">of a saliency map as a heat-sensing camera for the AI’s brain. When the AI looks at a picture of a gazelle, the saliency maps highlight the important areas of the gazelle such as the horns and the ears. Through these hot spots, the AI can deduce that the image can be labelled as an image representing a gazelle. A saliency map can turn the mathematical importance of each pixel into a visual guide that humans can understand. For instance, </w:t>
+      </w:r>
+      <w:r>
+        <w:rPr>
+          <w:sz w:val="26"/>
+          <w:szCs w:val="26"/>
+        </w:rPr>
+        <w:t xml:space="preserve">if you see high "heat" on a gazelle's body but none on the grass behind it, you know </w:t>
+      </w:r>
+      <w:r>
+        <w:rPr>
+          <w:sz w:val="26"/>
+          <w:szCs w:val="26"/>
+        </w:rPr>
+        <w:t xml:space="preserve">that </w:t>
+      </w:r>
+      <w:r>
+        <w:rPr>
+          <w:sz w:val="26"/>
+          <w:szCs w:val="26"/>
+        </w:rPr>
+        <w:t>the model is focused on the correct object rather than random background clues</w:t>
+      </w:r>
+      <w:r>
+        <w:rPr>
+          <w:sz w:val="26"/>
+          <w:szCs w:val="26"/>
+        </w:rPr>
+        <w:t>.</w:t>
+      </w:r>
+    </w:p>
+    <w:p>
+      <w:pPr>
+        <w:rPr>
+          <w:sz w:val="26"/>
+          <w:szCs w:val="26"/>
+        </w:rPr>
+      </w:pPr>
+      <w:r>
+        <w:rPr>
+          <w:sz w:val="26"/>
+          <w:szCs w:val="26"/>
+        </w:rPr>
+        <w:t xml:space="preserve">One problem that is common with basic gradients is the fact that these gradients are susceptible to noise where the gradients highlight </w:t>
+      </w:r>
+      <w:r>
+        <w:rPr>
+          <w:sz w:val="26"/>
+          <w:szCs w:val="26"/>
+        </w:rPr>
+        <w:t>random pixels that don't seem important to a human eye</w:t>
+      </w:r>
+      <w:r>
+        <w:rPr>
+          <w:sz w:val="26"/>
+          <w:szCs w:val="26"/>
+        </w:rPr>
+        <w:t xml:space="preserve">. It is like looking at a map through a cracked and blurry lens. </w:t>
+      </w:r>
+      <w:r>
+        <w:rPr>
+          <w:sz w:val="26"/>
+          <w:szCs w:val="26"/>
+        </w:rPr>
+        <w:t>You can see the general shape of the "hot spots," but there are random speckles everywhere</w:t>
+      </w:r>
+      <w:r>
+        <w:rPr>
+          <w:sz w:val="26"/>
+          <w:szCs w:val="26"/>
+        </w:rPr>
+        <w:t xml:space="preserve">. To solve this problem, methods such as </w:t>
+      </w:r>
+      <w:proofErr w:type="spellStart"/>
+      <w:r>
+        <w:rPr>
+          <w:sz w:val="26"/>
+          <w:szCs w:val="26"/>
+        </w:rPr>
+        <w:t>SmoothGrad</w:t>
+      </w:r>
+      <w:proofErr w:type="spellEnd"/>
+      <w:r>
+        <w:rPr>
+          <w:sz w:val="26"/>
+          <w:szCs w:val="26"/>
+        </w:rPr>
+        <w:t xml:space="preserve"> can be implemented. This technique would take slightly different versions of the image by adding a bit of static or noise to each image. The gradients for all of the images are then calculated </w:t>
+      </w:r>
+      <w:r>
+        <w:rPr>
+          <w:sz w:val="26"/>
+          <w:szCs w:val="26"/>
+        </w:rPr>
+        <w:t xml:space="preserve">and then averaged out. This technique is similar to </w:t>
+      </w:r>
+      <w:r>
+        <w:rPr>
+          <w:sz w:val="26"/>
+          <w:szCs w:val="26"/>
+        </w:rPr>
+        <w:t>taking 50 blurry photos of the same scene and layering them to get one sharp, clear picture</w:t>
+      </w:r>
+      <w:r>
+        <w:rPr>
+          <w:sz w:val="26"/>
+          <w:szCs w:val="26"/>
+        </w:rPr>
+        <w:t>.</w:t>
+      </w:r>
+    </w:p>
+    <w:p>
+      <w:pPr>
+        <w:rPr>
+          <w:sz w:val="26"/>
+          <w:szCs w:val="26"/>
+        </w:rPr>
+      </w:pPr>
+      <w:r>
+        <w:rPr>
+          <w:sz w:val="26"/>
+          <w:szCs w:val="26"/>
+        </w:rPr>
+        <w:t xml:space="preserve">Saliency Maps and Input Gradients are important for a network’s decision making as it can help developers debug models. For example, if a self-driving car </w:t>
+      </w:r>
+      <w:r>
+        <w:rPr>
+          <w:sz w:val="26"/>
+          <w:szCs w:val="26"/>
+        </w:rPr>
+        <w:t>fails to brake for a fire</w:t>
+      </w:r>
+      <w:r>
+        <w:rPr>
+          <w:sz w:val="26"/>
+          <w:szCs w:val="26"/>
+        </w:rPr>
+        <w:t xml:space="preserve"> </w:t>
+      </w:r>
+      <w:r>
+        <w:rPr>
+          <w:sz w:val="26"/>
+          <w:szCs w:val="26"/>
+        </w:rPr>
+        <w:t>truck, a saliency map could reveal if the AI was actually "looking" at the truck or was distracted by a bright sign on the side of the road</w:t>
+      </w:r>
+      <w:r>
+        <w:rPr>
+          <w:sz w:val="26"/>
+          <w:szCs w:val="26"/>
+        </w:rPr>
+        <w:t>. By identifying the pixels that carry the most weight, we can make sure that the model is learning the correct rules instead of finding shortcuts.</w:t>
+      </w:r>
+    </w:p>
+    <w:p>
+      <w:pPr>
+        <w:rPr>
+          <w:sz w:val="26"/>
+          <w:szCs w:val="26"/>
+        </w:rPr>
+      </w:pPr>
+      <w:r>
+        <w:rPr>
+          <w:sz w:val="26"/>
+          <w:szCs w:val="26"/>
+        </w:rPr>
+        <w:t xml:space="preserve">There are various </w:t>
+      </w:r>
+      <w:r>
+        <w:rPr>
+          <w:b/>
+          <w:bCs/>
+          <w:sz w:val="26"/>
+          <w:szCs w:val="26"/>
+        </w:rPr>
+        <w:t>mathematical formulations</w:t>
+      </w:r>
+      <w:r>
+        <w:rPr>
+          <w:sz w:val="26"/>
+          <w:szCs w:val="26"/>
+        </w:rPr>
+        <w:t xml:space="preserve"> that are used:</w:t>
+      </w:r>
+    </w:p>
+    <w:p>
+      <w:pPr>
+        <w:rPr>
+          <w:b/>
+          <w:bCs/>
+          <w:sz w:val="26"/>
+          <w:szCs w:val="26"/>
+          <w:u w:val="single"/>
+        </w:rPr>
+      </w:pPr>
+      <w:r>
+        <w:rPr>
+          <w:b/>
+          <w:bCs/>
+          <w:sz w:val="26"/>
+          <w:szCs w:val="26"/>
+          <w:u w:val="single"/>
         </w:rPr>
         <w:t>Vanilla Saliency Maps (Input Gradients)</w:t>
       </w:r>
@@ -490,6 +1191,7 @@
           <w:sz w:val="26"/>
           <w:szCs w:val="26"/>
         </w:rPr>
+        <w:lastRenderedPageBreak/>
         <w:t xml:space="preserve">A forward pass </w:t>
       </w:r>
       <w:r>
@@ -577,6 +1279,7 @@
           <w:bCs/>
           <w:sz w:val="26"/>
           <w:szCs w:val="26"/>
+          <w:u w:val="single"/>
         </w:rPr>
       </w:pPr>
       <w:r>
@@ -585,6 +1288,7 @@
           <w:bCs/>
           <w:sz w:val="26"/>
           <w:szCs w:val="26"/>
+          <w:u w:val="single"/>
         </w:rPr>
         <w:t xml:space="preserve">Guided Backpropagation </w:t>
       </w:r>
@@ -679,7 +1383,6 @@
           <w:sz w:val="26"/>
           <w:szCs w:val="26"/>
         </w:rPr>
-        <w:lastRenderedPageBreak/>
         <w:t xml:space="preserve">During backpropagation, at each </w:t>
       </w:r>
       <w:proofErr w:type="spellStart"/>
@@ -740,6 +1443,7 @@
           <w:bCs/>
           <w:sz w:val="26"/>
           <w:szCs w:val="26"/>
+          <w:u w:val="single"/>
         </w:rPr>
       </w:pPr>
       <w:proofErr w:type="spellStart"/>
@@ -749,6 +1453,7 @@
           <w:bCs/>
           <w:sz w:val="26"/>
           <w:szCs w:val="26"/>
+          <w:u w:val="single"/>
         </w:rPr>
         <w:t>SmoothGrad</w:t>
       </w:r>
@@ -1164,6 +1869,7 @@
           <w:sz w:val="26"/>
           <w:szCs w:val="26"/>
         </w:rPr>
+        <w:lastRenderedPageBreak/>
         <w:t>N perturbed images are then generated by adding random Gaussian noise to the original input x</w:t>
       </w:r>
     </w:p>
@@ -1231,6 +1937,29 @@
       <w:pPr>
         <w:rPr>
           <w:rFonts w:eastAsiaTheme="minorEastAsia"/>
+          <w:b/>
+          <w:bCs/>
+          <w:sz w:val="26"/>
+          <w:szCs w:val="26"/>
+          <w:u w:val="single"/>
+        </w:rPr>
+      </w:pPr>
+      <w:r>
+        <w:rPr>
+          <w:rFonts w:eastAsiaTheme="minorEastAsia"/>
+          <w:b/>
+          <w:bCs/>
+          <w:sz w:val="26"/>
+          <w:szCs w:val="26"/>
+          <w:u w:val="single"/>
+        </w:rPr>
+        <w:t>Failure Modes</w:t>
+      </w:r>
+    </w:p>
+    <w:p>
+      <w:pPr>
+        <w:rPr>
+          <w:rFonts w:eastAsiaTheme="minorEastAsia"/>
           <w:sz w:val="26"/>
           <w:szCs w:val="26"/>
         </w:rPr>
@@ -1267,7 +1996,6 @@
           <w:sz w:val="26"/>
           <w:szCs w:val="26"/>
         </w:rPr>
-        <w:lastRenderedPageBreak/>
         <w:t>Kindermans</w:t>
       </w:r>
       <w:proofErr w:type="spellEnd"/>
@@ -1370,6 +2098,7 @@
           <w:sz w:val="26"/>
           <w:szCs w:val="26"/>
         </w:rPr>
+        <w:lastRenderedPageBreak/>
         <w:t>attributing differently based on how the network was built rather than how it behaves</w:t>
       </w:r>
     </w:p>
@@ -1514,25 +2243,45 @@
           <w:sz w:val="26"/>
           <w:szCs w:val="26"/>
         </w:rPr>
-        <w:lastRenderedPageBreak/>
         <w:t>Information Overload: For lay-users, high-dimensional feature importance vectors can be overwhelming and redundant, describing the full decision logic rather than providing a concise, human-friendly summary</w:t>
       </w:r>
     </w:p>
     <w:p>
       <w:pPr>
-        <w:rPr>
-          <w:rFonts w:eastAsiaTheme="minorEastAsia"/>
-          <w:sz w:val="26"/>
-          <w:szCs w:val="26"/>
-        </w:rPr>
-      </w:pPr>
-      <w:r>
         <w:rPr>
           <w:rFonts w:eastAsiaTheme="minorEastAsia"/>
           <w:b/>
           <w:bCs/>
           <w:sz w:val="26"/>
           <w:szCs w:val="26"/>
+          <w:u w:val="single"/>
+        </w:rPr>
+      </w:pPr>
+      <w:r>
+        <w:rPr>
+          <w:rFonts w:eastAsiaTheme="minorEastAsia"/>
+          <w:b/>
+          <w:bCs/>
+          <w:sz w:val="26"/>
+          <w:szCs w:val="26"/>
+          <w:u w:val="single"/>
+        </w:rPr>
+        <w:t>Real-World Applications</w:t>
+      </w:r>
+    </w:p>
+    <w:p>
+      <w:pPr>
+        <w:rPr>
+          <w:rFonts w:eastAsiaTheme="minorEastAsia"/>
+          <w:sz w:val="26"/>
+          <w:szCs w:val="26"/>
+        </w:rPr>
+      </w:pPr>
+      <w:r>
+        <w:rPr>
+          <w:rFonts w:eastAsiaTheme="minorEastAsia"/>
+          <w:sz w:val="26"/>
+          <w:szCs w:val="26"/>
         </w:rPr>
         <w:t>Saliency M</w:t>
       </w:r>
@@ -1624,7 +2373,16 @@
           <w:sz w:val="26"/>
           <w:szCs w:val="26"/>
         </w:rPr>
-        <w:t xml:space="preserve">. For end-users, </w:t>
+        <w:t>. For end-</w:t>
+      </w:r>
+      <w:r>
+        <w:rPr>
+          <w:rFonts w:eastAsiaTheme="minorEastAsia"/>
+          <w:sz w:val="26"/>
+          <w:szCs w:val="26"/>
+        </w:rPr>
+        <w:lastRenderedPageBreak/>
+        <w:t xml:space="preserve">users, </w:t>
       </w:r>
       <w:r>
         <w:rPr>
@@ -1813,7 +2571,6 @@
           <w:sz w:val="26"/>
           <w:szCs w:val="26"/>
         </w:rPr>
-        <w:lastRenderedPageBreak/>
         <w:t xml:space="preserve">Saliency-like mechanisms can be integrated into various </w:t>
       </w:r>
       <w:r>
@@ -2197,6 +2954,7 @@
           <w:sz w:val="26"/>
           <w:szCs w:val="26"/>
         </w:rPr>
+        <w:lastRenderedPageBreak/>
         <w:t>From this, we can determine that x</w:t>
       </w:r>
       <w:r>
@@ -2878,343 +3636,343 @@
           <w:sz w:val="26"/>
           <w:szCs w:val="26"/>
         </w:rPr>
+        <w:t xml:space="preserve">In this example, we can see how </w:t>
+      </w:r>
+      <w:proofErr w:type="spellStart"/>
+      <w:r>
+        <w:rPr>
+          <w:rFonts w:eastAsiaTheme="minorEastAsia"/>
+          <w:sz w:val="26"/>
+          <w:szCs w:val="26"/>
+        </w:rPr>
+        <w:t>SmoothGrad</w:t>
+      </w:r>
+      <w:proofErr w:type="spellEnd"/>
+      <w:r>
+        <w:rPr>
+          <w:rFonts w:eastAsiaTheme="minorEastAsia"/>
+          <w:sz w:val="26"/>
+          <w:szCs w:val="26"/>
+        </w:rPr>
+        <w:t xml:space="preserve"> </w:t>
+      </w:r>
+      <w:r>
+        <w:rPr>
+          <w:rFonts w:eastAsiaTheme="minorEastAsia"/>
+          <w:sz w:val="26"/>
+          <w:szCs w:val="26"/>
+        </w:rPr>
+        <w:t>can be</w:t>
+      </w:r>
+      <w:r>
+        <w:rPr>
+          <w:rFonts w:eastAsiaTheme="minorEastAsia"/>
+          <w:sz w:val="26"/>
+          <w:szCs w:val="26"/>
+        </w:rPr>
+        <w:t xml:space="preserve"> used to “sharpen” any noisy gradient-based maps.</w:t>
+      </w:r>
+    </w:p>
+    <w:p>
+      <w:pPr>
+        <w:rPr>
+          <w:rFonts w:ascii="Arial" w:eastAsiaTheme="minorEastAsia" w:hAnsi="Arial" w:cs="Arial"/>
+          <w:sz w:val="26"/>
+          <w:szCs w:val="26"/>
+        </w:rPr>
+      </w:pPr>
+      <w:r>
+        <w:rPr>
+          <w:rFonts w:eastAsiaTheme="minorEastAsia"/>
+          <w:sz w:val="26"/>
+          <w:szCs w:val="26"/>
+        </w:rPr>
+        <w:t xml:space="preserve">Assume the model is defined as </w:t>
+      </w:r>
+      <w:r>
+        <w:rPr>
+          <w:rFonts w:eastAsiaTheme="minorEastAsia"/>
+          <w:sz w:val="26"/>
+          <w:szCs w:val="26"/>
+        </w:rPr>
+        <w:t>y=x</w:t>
+      </w:r>
+      <w:r>
+        <w:rPr>
+          <w:rFonts w:eastAsiaTheme="minorEastAsia"/>
+          <w:sz w:val="26"/>
+          <w:szCs w:val="26"/>
+          <w:vertAlign w:val="subscript"/>
+        </w:rPr>
+        <w:t>1</w:t>
+      </w:r>
+      <w:r>
+        <w:rPr>
+          <w:rFonts w:ascii="Arial" w:eastAsiaTheme="minorEastAsia" w:hAnsi="Arial" w:cs="Arial"/>
+          <w:sz w:val="26"/>
+          <w:szCs w:val="26"/>
+        </w:rPr>
+        <w:t>​</w:t>
+      </w:r>
+      <w:r>
+        <w:rPr>
+          <w:rFonts w:eastAsiaTheme="minorEastAsia"/>
+          <w:sz w:val="26"/>
+          <w:szCs w:val="26"/>
+        </w:rPr>
+        <w:t>+2x</w:t>
+      </w:r>
+      <w:r>
+        <w:rPr>
+          <w:rFonts w:eastAsiaTheme="minorEastAsia"/>
+          <w:sz w:val="26"/>
+          <w:szCs w:val="26"/>
+          <w:vertAlign w:val="subscript"/>
+        </w:rPr>
+        <w:t>2</w:t>
+      </w:r>
+      <w:r>
+        <w:rPr>
+          <w:rFonts w:ascii="Arial" w:eastAsiaTheme="minorEastAsia" w:hAnsi="Arial" w:cs="Arial"/>
+          <w:sz w:val="26"/>
+          <w:szCs w:val="26"/>
+        </w:rPr>
+        <w:t>​</w:t>
+      </w:r>
+      <w:r>
+        <w:rPr>
+          <w:rFonts w:ascii="Arial" w:eastAsiaTheme="minorEastAsia" w:hAnsi="Arial" w:cs="Arial"/>
+          <w:sz w:val="26"/>
+          <w:szCs w:val="26"/>
+        </w:rPr>
+        <w:t xml:space="preserve"> and the input of x is [1, 1]</w:t>
+      </w:r>
+    </w:p>
+    <w:p>
+      <w:pPr>
+        <w:rPr>
+          <w:rFonts w:ascii="Arial" w:eastAsiaTheme="minorEastAsia" w:hAnsi="Arial" w:cs="Arial"/>
+          <w:sz w:val="26"/>
+          <w:szCs w:val="26"/>
+        </w:rPr>
+      </w:pPr>
+      <w:r>
+        <w:rPr>
+          <w:rFonts w:ascii="Arial" w:eastAsiaTheme="minorEastAsia" w:hAnsi="Arial" w:cs="Arial"/>
+          <w:sz w:val="26"/>
+          <w:szCs w:val="26"/>
+        </w:rPr>
+        <w:t>We define the Vanilla Gradient as S = [1, 2] and we add noise samples to the input of x</w:t>
+      </w:r>
+    </w:p>
+    <w:p>
+      <w:pPr>
+        <w:rPr>
+          <w:rFonts w:ascii="Arial" w:eastAsiaTheme="minorEastAsia" w:hAnsi="Arial" w:cs="Arial"/>
+          <w:sz w:val="26"/>
+          <w:szCs w:val="26"/>
+        </w:rPr>
+      </w:pPr>
+      <w:r>
+        <w:rPr>
+          <w:rFonts w:ascii="Arial" w:eastAsiaTheme="minorEastAsia" w:hAnsi="Arial" w:cs="Arial"/>
+          <w:sz w:val="26"/>
+          <w:szCs w:val="26"/>
+        </w:rPr>
+        <w:t>Two samples were then taken:</w:t>
+      </w:r>
+    </w:p>
+    <w:p>
+      <w:pPr>
+        <w:rPr>
+          <w:rFonts w:ascii="Arial" w:eastAsiaTheme="minorEastAsia" w:hAnsi="Arial" w:cs="Arial"/>
+          <w:sz w:val="26"/>
+          <w:szCs w:val="26"/>
+        </w:rPr>
+      </w:pPr>
+      <w:r>
+        <w:rPr>
+          <w:rFonts w:ascii="Arial" w:eastAsiaTheme="minorEastAsia" w:hAnsi="Arial" w:cs="Arial"/>
+          <w:sz w:val="26"/>
+          <w:szCs w:val="26"/>
+        </w:rPr>
+        <w:t>Sample 1: [+0.1,−0.1]</w:t>
+      </w:r>
+    </w:p>
+    <w:p>
+      <w:pPr>
+        <w:rPr>
+          <w:rFonts w:ascii="Arial" w:eastAsiaTheme="minorEastAsia" w:hAnsi="Arial" w:cs="Arial"/>
+          <w:sz w:val="26"/>
+          <w:szCs w:val="26"/>
+        </w:rPr>
+      </w:pPr>
+      <w:r>
+        <w:rPr>
+          <w:rFonts w:ascii="Arial" w:eastAsiaTheme="minorEastAsia" w:hAnsi="Arial" w:cs="Arial"/>
+          <w:sz w:val="26"/>
+          <w:szCs w:val="26"/>
+        </w:rPr>
+        <w:t>Sample 2: [−0.2,+0.1]</w:t>
+      </w:r>
+    </w:p>
+    <w:p>
+      <w:pPr>
+        <w:rPr>
+          <w:rFonts w:ascii="Arial" w:eastAsiaTheme="minorEastAsia" w:hAnsi="Arial" w:cs="Arial"/>
+          <w:sz w:val="26"/>
+          <w:szCs w:val="26"/>
+        </w:rPr>
+      </w:pPr>
+      <w:r>
+        <w:rPr>
+          <w:rFonts w:ascii="Arial" w:eastAsiaTheme="minorEastAsia" w:hAnsi="Arial" w:cs="Arial"/>
+          <w:sz w:val="26"/>
+          <w:szCs w:val="26"/>
+        </w:rPr>
+        <w:t xml:space="preserve">When adding the noise samples to the input, we can deduce that the input x is close to the vanilla gradient. This shows that despite adding noise, the stable features still remain </w:t>
+      </w:r>
+      <w:proofErr w:type="gramStart"/>
+      <w:r>
+        <w:rPr>
+          <w:rFonts w:ascii="Arial" w:eastAsiaTheme="minorEastAsia" w:hAnsi="Arial" w:cs="Arial"/>
+          <w:sz w:val="26"/>
+          <w:szCs w:val="26"/>
+        </w:rPr>
+        <w:t>consistent</w:t>
+      </w:r>
+      <w:proofErr w:type="gramEnd"/>
+      <w:r>
+        <w:rPr>
+          <w:rFonts w:ascii="Arial" w:eastAsiaTheme="minorEastAsia" w:hAnsi="Arial" w:cs="Arial"/>
+          <w:sz w:val="26"/>
+          <w:szCs w:val="26"/>
+        </w:rPr>
+        <w:t xml:space="preserve"> and the noise cancels itself out</w:t>
+      </w:r>
+    </w:p>
+    <w:p>
+      <w:pPr>
+        <w:rPr>
+          <w:rFonts w:ascii="Arial" w:eastAsiaTheme="minorEastAsia" w:hAnsi="Arial" w:cs="Arial"/>
+          <w:sz w:val="26"/>
+          <w:szCs w:val="26"/>
+        </w:rPr>
+      </w:pPr>
+      <w:r>
+        <w:rPr>
+          <w:rFonts w:ascii="Arial" w:eastAsiaTheme="minorEastAsia" w:hAnsi="Arial" w:cs="Arial"/>
+          <w:sz w:val="26"/>
+          <w:szCs w:val="26"/>
+        </w:rPr>
+        <w:t>This can be proved through the following equations:</w:t>
+      </w:r>
+    </w:p>
+    <w:p>
+      <w:pPr>
+        <w:rPr>
+          <w:rFonts w:ascii="Arial" w:eastAsiaTheme="minorEastAsia" w:hAnsi="Arial" w:cs="Arial"/>
+          <w:sz w:val="26"/>
+          <w:szCs w:val="26"/>
+        </w:rPr>
+      </w:pPr>
+      <w:r>
+        <w:rPr>
+          <w:rFonts w:ascii="Arial" w:eastAsiaTheme="minorEastAsia" w:hAnsi="Arial" w:cs="Arial"/>
+          <w:sz w:val="26"/>
+          <w:szCs w:val="26"/>
+        </w:rPr>
+        <w:t>Sample 1</w:t>
+      </w:r>
+    </w:p>
+    <w:p>
+      <w:pPr>
+        <w:rPr>
+          <w:rFonts w:ascii="Arial" w:eastAsiaTheme="minorEastAsia" w:hAnsi="Arial" w:cs="Arial"/>
+          <w:sz w:val="26"/>
+          <w:szCs w:val="26"/>
+        </w:rPr>
+      </w:pPr>
+      <w:r>
+        <w:rPr>
+          <w:rFonts w:ascii="Arial" w:eastAsiaTheme="minorEastAsia" w:hAnsi="Arial" w:cs="Arial"/>
+          <w:sz w:val="26"/>
+          <w:szCs w:val="26"/>
+        </w:rPr>
+        <w:t xml:space="preserve">x </w:t>
+      </w:r>
+      <w:r>
+        <w:rPr>
+          <w:rFonts w:ascii="Arial" w:eastAsiaTheme="minorEastAsia" w:hAnsi="Arial" w:cs="Arial"/>
+          <w:sz w:val="26"/>
+          <w:szCs w:val="26"/>
+        </w:rPr>
+        <w:t>=</w:t>
+      </w:r>
+      <w:r>
+        <w:rPr>
+          <w:rFonts w:ascii="Arial" w:eastAsiaTheme="minorEastAsia" w:hAnsi="Arial" w:cs="Arial"/>
+          <w:sz w:val="26"/>
+          <w:szCs w:val="26"/>
+        </w:rPr>
+        <w:t xml:space="preserve"> </w:t>
+      </w:r>
+      <w:r>
+        <w:rPr>
+          <w:rFonts w:ascii="Arial" w:eastAsiaTheme="minorEastAsia" w:hAnsi="Arial" w:cs="Arial"/>
+          <w:sz w:val="26"/>
+          <w:szCs w:val="26"/>
+        </w:rPr>
+        <w:t>[1.1,</w:t>
+      </w:r>
+      <w:r>
+        <w:rPr>
+          <w:rFonts w:ascii="Arial" w:eastAsiaTheme="minorEastAsia" w:hAnsi="Arial" w:cs="Arial"/>
+          <w:sz w:val="26"/>
+          <w:szCs w:val="26"/>
+        </w:rPr>
+        <w:t xml:space="preserve"> </w:t>
+      </w:r>
+      <w:r>
+        <w:rPr>
+          <w:rFonts w:ascii="Arial" w:eastAsiaTheme="minorEastAsia" w:hAnsi="Arial" w:cs="Arial"/>
+          <w:sz w:val="26"/>
+          <w:szCs w:val="26"/>
+        </w:rPr>
+        <w:t>0.9]</w:t>
+      </w:r>
+      <w:r>
+        <w:rPr>
+          <w:rFonts w:ascii="Arial" w:eastAsiaTheme="minorEastAsia" w:hAnsi="Arial" w:cs="Arial"/>
+          <w:sz w:val="26"/>
+          <w:szCs w:val="26"/>
+        </w:rPr>
+        <w:t xml:space="preserve"> -&gt; </w:t>
+      </w:r>
+      <w:r>
+        <w:rPr>
+          <w:rFonts w:ascii="Arial" w:eastAsiaTheme="minorEastAsia" w:hAnsi="Arial" w:cs="Arial"/>
+          <w:sz w:val="26"/>
+          <w:szCs w:val="26"/>
+        </w:rPr>
+        <w:t>S=[1,2]</w:t>
+      </w:r>
+    </w:p>
+    <w:p>
+      <w:pPr>
+        <w:rPr>
+          <w:rFonts w:ascii="Arial" w:eastAsiaTheme="minorEastAsia" w:hAnsi="Arial" w:cs="Arial"/>
+          <w:sz w:val="26"/>
+          <w:szCs w:val="26"/>
+        </w:rPr>
+      </w:pPr>
+      <w:r>
+        <w:rPr>
+          <w:rFonts w:ascii="Arial" w:eastAsiaTheme="minorEastAsia" w:hAnsi="Arial" w:cs="Arial"/>
+          <w:sz w:val="26"/>
+          <w:szCs w:val="26"/>
+        </w:rPr>
         <w:lastRenderedPageBreak/>
-        <w:t xml:space="preserve">In this example, we can see how </w:t>
-      </w:r>
-      <w:proofErr w:type="spellStart"/>
-      <w:r>
-        <w:rPr>
-          <w:rFonts w:eastAsiaTheme="minorEastAsia"/>
-          <w:sz w:val="26"/>
-          <w:szCs w:val="26"/>
-        </w:rPr>
-        <w:t>SmoothGrad</w:t>
-      </w:r>
-      <w:proofErr w:type="spellEnd"/>
-      <w:r>
-        <w:rPr>
-          <w:rFonts w:eastAsiaTheme="minorEastAsia"/>
-          <w:sz w:val="26"/>
-          <w:szCs w:val="26"/>
-        </w:rPr>
-        <w:t xml:space="preserve"> </w:t>
-      </w:r>
-      <w:r>
-        <w:rPr>
-          <w:rFonts w:eastAsiaTheme="minorEastAsia"/>
-          <w:sz w:val="26"/>
-          <w:szCs w:val="26"/>
-        </w:rPr>
-        <w:t>can be</w:t>
-      </w:r>
-      <w:r>
-        <w:rPr>
-          <w:rFonts w:eastAsiaTheme="minorEastAsia"/>
-          <w:sz w:val="26"/>
-          <w:szCs w:val="26"/>
-        </w:rPr>
-        <w:t xml:space="preserve"> used to “sharpen” any noisy gradient-based maps.</w:t>
-      </w:r>
-    </w:p>
-    <w:p>
-      <w:pPr>
-        <w:rPr>
-          <w:rFonts w:ascii="Arial" w:eastAsiaTheme="minorEastAsia" w:hAnsi="Arial" w:cs="Arial"/>
-          <w:sz w:val="26"/>
-          <w:szCs w:val="26"/>
-        </w:rPr>
-      </w:pPr>
-      <w:r>
-        <w:rPr>
-          <w:rFonts w:eastAsiaTheme="minorEastAsia"/>
-          <w:sz w:val="26"/>
-          <w:szCs w:val="26"/>
-        </w:rPr>
-        <w:t xml:space="preserve">Assume the model is defined as </w:t>
-      </w:r>
-      <w:r>
-        <w:rPr>
-          <w:rFonts w:eastAsiaTheme="minorEastAsia"/>
-          <w:sz w:val="26"/>
-          <w:szCs w:val="26"/>
-        </w:rPr>
-        <w:t>y=x</w:t>
-      </w:r>
-      <w:r>
-        <w:rPr>
-          <w:rFonts w:eastAsiaTheme="minorEastAsia"/>
-          <w:sz w:val="26"/>
-          <w:szCs w:val="26"/>
-          <w:vertAlign w:val="subscript"/>
-        </w:rPr>
-        <w:t>1</w:t>
-      </w:r>
-      <w:r>
-        <w:rPr>
-          <w:rFonts w:ascii="Arial" w:eastAsiaTheme="minorEastAsia" w:hAnsi="Arial" w:cs="Arial"/>
-          <w:sz w:val="26"/>
-          <w:szCs w:val="26"/>
-        </w:rPr>
-        <w:t>​</w:t>
-      </w:r>
-      <w:r>
-        <w:rPr>
-          <w:rFonts w:eastAsiaTheme="minorEastAsia"/>
-          <w:sz w:val="26"/>
-          <w:szCs w:val="26"/>
-        </w:rPr>
-        <w:t>+2x</w:t>
-      </w:r>
-      <w:r>
-        <w:rPr>
-          <w:rFonts w:eastAsiaTheme="minorEastAsia"/>
-          <w:sz w:val="26"/>
-          <w:szCs w:val="26"/>
-          <w:vertAlign w:val="subscript"/>
-        </w:rPr>
-        <w:t>2</w:t>
-      </w:r>
-      <w:r>
-        <w:rPr>
-          <w:rFonts w:ascii="Arial" w:eastAsiaTheme="minorEastAsia" w:hAnsi="Arial" w:cs="Arial"/>
-          <w:sz w:val="26"/>
-          <w:szCs w:val="26"/>
-        </w:rPr>
-        <w:t>​</w:t>
-      </w:r>
-      <w:r>
-        <w:rPr>
-          <w:rFonts w:ascii="Arial" w:eastAsiaTheme="minorEastAsia" w:hAnsi="Arial" w:cs="Arial"/>
-          <w:sz w:val="26"/>
-          <w:szCs w:val="26"/>
-        </w:rPr>
-        <w:t xml:space="preserve"> and the input of x is [1, 1]</w:t>
-      </w:r>
-    </w:p>
-    <w:p>
-      <w:pPr>
-        <w:rPr>
-          <w:rFonts w:ascii="Arial" w:eastAsiaTheme="minorEastAsia" w:hAnsi="Arial" w:cs="Arial"/>
-          <w:sz w:val="26"/>
-          <w:szCs w:val="26"/>
-        </w:rPr>
-      </w:pPr>
-      <w:r>
-        <w:rPr>
-          <w:rFonts w:ascii="Arial" w:eastAsiaTheme="minorEastAsia" w:hAnsi="Arial" w:cs="Arial"/>
-          <w:sz w:val="26"/>
-          <w:szCs w:val="26"/>
-        </w:rPr>
-        <w:t>We define the Vanilla Gradient as S = [1, 2] and we add noise samples to the input of x</w:t>
-      </w:r>
-    </w:p>
-    <w:p>
-      <w:pPr>
-        <w:rPr>
-          <w:rFonts w:ascii="Arial" w:eastAsiaTheme="minorEastAsia" w:hAnsi="Arial" w:cs="Arial"/>
-          <w:sz w:val="26"/>
-          <w:szCs w:val="26"/>
-        </w:rPr>
-      </w:pPr>
-      <w:r>
-        <w:rPr>
-          <w:rFonts w:ascii="Arial" w:eastAsiaTheme="minorEastAsia" w:hAnsi="Arial" w:cs="Arial"/>
-          <w:sz w:val="26"/>
-          <w:szCs w:val="26"/>
-        </w:rPr>
-        <w:t>Two samples were then taken:</w:t>
-      </w:r>
-    </w:p>
-    <w:p>
-      <w:pPr>
-        <w:rPr>
-          <w:rFonts w:ascii="Arial" w:eastAsiaTheme="minorEastAsia" w:hAnsi="Arial" w:cs="Arial"/>
-          <w:sz w:val="26"/>
-          <w:szCs w:val="26"/>
-        </w:rPr>
-      </w:pPr>
-      <w:r>
-        <w:rPr>
-          <w:rFonts w:ascii="Arial" w:eastAsiaTheme="minorEastAsia" w:hAnsi="Arial" w:cs="Arial"/>
-          <w:sz w:val="26"/>
-          <w:szCs w:val="26"/>
-        </w:rPr>
-        <w:t>Sample 1: [+0.1,−0.1]</w:t>
-      </w:r>
-    </w:p>
-    <w:p>
-      <w:pPr>
-        <w:rPr>
-          <w:rFonts w:ascii="Arial" w:eastAsiaTheme="minorEastAsia" w:hAnsi="Arial" w:cs="Arial"/>
-          <w:sz w:val="26"/>
-          <w:szCs w:val="26"/>
-        </w:rPr>
-      </w:pPr>
-      <w:r>
-        <w:rPr>
-          <w:rFonts w:ascii="Arial" w:eastAsiaTheme="minorEastAsia" w:hAnsi="Arial" w:cs="Arial"/>
-          <w:sz w:val="26"/>
-          <w:szCs w:val="26"/>
-        </w:rPr>
-        <w:t>Sample 2: [−0.2,+0.1]</w:t>
-      </w:r>
-    </w:p>
-    <w:p>
-      <w:pPr>
-        <w:rPr>
-          <w:rFonts w:ascii="Arial" w:eastAsiaTheme="minorEastAsia" w:hAnsi="Arial" w:cs="Arial"/>
-          <w:sz w:val="26"/>
-          <w:szCs w:val="26"/>
-        </w:rPr>
-      </w:pPr>
-      <w:r>
-        <w:rPr>
-          <w:rFonts w:ascii="Arial" w:eastAsiaTheme="minorEastAsia" w:hAnsi="Arial" w:cs="Arial"/>
-          <w:sz w:val="26"/>
-          <w:szCs w:val="26"/>
-        </w:rPr>
-        <w:t xml:space="preserve">When adding the noise samples to the input, we can deduce that the input x is close to the vanilla gradient. This shows that despite adding noise, the stable features still remain </w:t>
-      </w:r>
-      <w:proofErr w:type="gramStart"/>
-      <w:r>
-        <w:rPr>
-          <w:rFonts w:ascii="Arial" w:eastAsiaTheme="minorEastAsia" w:hAnsi="Arial" w:cs="Arial"/>
-          <w:sz w:val="26"/>
-          <w:szCs w:val="26"/>
-        </w:rPr>
-        <w:t>consistent</w:t>
-      </w:r>
-      <w:proofErr w:type="gramEnd"/>
-      <w:r>
-        <w:rPr>
-          <w:rFonts w:ascii="Arial" w:eastAsiaTheme="minorEastAsia" w:hAnsi="Arial" w:cs="Arial"/>
-          <w:sz w:val="26"/>
-          <w:szCs w:val="26"/>
-        </w:rPr>
-        <w:t xml:space="preserve"> and the noise cancels itself out</w:t>
-      </w:r>
-    </w:p>
-    <w:p>
-      <w:pPr>
-        <w:rPr>
-          <w:rFonts w:ascii="Arial" w:eastAsiaTheme="minorEastAsia" w:hAnsi="Arial" w:cs="Arial"/>
-          <w:sz w:val="26"/>
-          <w:szCs w:val="26"/>
-        </w:rPr>
-      </w:pPr>
-      <w:r>
-        <w:rPr>
-          <w:rFonts w:ascii="Arial" w:eastAsiaTheme="minorEastAsia" w:hAnsi="Arial" w:cs="Arial"/>
-          <w:sz w:val="26"/>
-          <w:szCs w:val="26"/>
-        </w:rPr>
-        <w:t>This can be proved through the following equations:</w:t>
-      </w:r>
-    </w:p>
-    <w:p>
-      <w:pPr>
-        <w:rPr>
-          <w:rFonts w:ascii="Arial" w:eastAsiaTheme="minorEastAsia" w:hAnsi="Arial" w:cs="Arial"/>
-          <w:sz w:val="26"/>
-          <w:szCs w:val="26"/>
-        </w:rPr>
-      </w:pPr>
-      <w:r>
-        <w:rPr>
-          <w:rFonts w:ascii="Arial" w:eastAsiaTheme="minorEastAsia" w:hAnsi="Arial" w:cs="Arial"/>
-          <w:sz w:val="26"/>
-          <w:szCs w:val="26"/>
-        </w:rPr>
-        <w:t>Sample 1</w:t>
-      </w:r>
-    </w:p>
-    <w:p>
-      <w:pPr>
-        <w:rPr>
-          <w:rFonts w:ascii="Arial" w:eastAsiaTheme="minorEastAsia" w:hAnsi="Arial" w:cs="Arial"/>
-          <w:sz w:val="26"/>
-          <w:szCs w:val="26"/>
-        </w:rPr>
-      </w:pPr>
-      <w:r>
-        <w:rPr>
-          <w:rFonts w:ascii="Arial" w:eastAsiaTheme="minorEastAsia" w:hAnsi="Arial" w:cs="Arial"/>
-          <w:sz w:val="26"/>
-          <w:szCs w:val="26"/>
-        </w:rPr>
-        <w:t xml:space="preserve">x </w:t>
-      </w:r>
-      <w:r>
-        <w:rPr>
-          <w:rFonts w:ascii="Arial" w:eastAsiaTheme="minorEastAsia" w:hAnsi="Arial" w:cs="Arial"/>
-          <w:sz w:val="26"/>
-          <w:szCs w:val="26"/>
-        </w:rPr>
-        <w:t>=</w:t>
-      </w:r>
-      <w:r>
-        <w:rPr>
-          <w:rFonts w:ascii="Arial" w:eastAsiaTheme="minorEastAsia" w:hAnsi="Arial" w:cs="Arial"/>
-          <w:sz w:val="26"/>
-          <w:szCs w:val="26"/>
-        </w:rPr>
-        <w:t xml:space="preserve"> </w:t>
-      </w:r>
-      <w:r>
-        <w:rPr>
-          <w:rFonts w:ascii="Arial" w:eastAsiaTheme="minorEastAsia" w:hAnsi="Arial" w:cs="Arial"/>
-          <w:sz w:val="26"/>
-          <w:szCs w:val="26"/>
-        </w:rPr>
-        <w:t>[1.1,</w:t>
-      </w:r>
-      <w:r>
-        <w:rPr>
-          <w:rFonts w:ascii="Arial" w:eastAsiaTheme="minorEastAsia" w:hAnsi="Arial" w:cs="Arial"/>
-          <w:sz w:val="26"/>
-          <w:szCs w:val="26"/>
-        </w:rPr>
-        <w:t xml:space="preserve"> </w:t>
-      </w:r>
-      <w:r>
-        <w:rPr>
-          <w:rFonts w:ascii="Arial" w:eastAsiaTheme="minorEastAsia" w:hAnsi="Arial" w:cs="Arial"/>
-          <w:sz w:val="26"/>
-          <w:szCs w:val="26"/>
-        </w:rPr>
-        <w:t>0.9]</w:t>
-      </w:r>
-      <w:r>
-        <w:rPr>
-          <w:rFonts w:ascii="Arial" w:eastAsiaTheme="minorEastAsia" w:hAnsi="Arial" w:cs="Arial"/>
-          <w:sz w:val="26"/>
-          <w:szCs w:val="26"/>
-        </w:rPr>
-        <w:t xml:space="preserve"> -&gt; </w:t>
-      </w:r>
-      <w:r>
-        <w:rPr>
-          <w:rFonts w:ascii="Arial" w:eastAsiaTheme="minorEastAsia" w:hAnsi="Arial" w:cs="Arial"/>
-          <w:sz w:val="26"/>
-          <w:szCs w:val="26"/>
-        </w:rPr>
-        <w:t>S=[1,2]</w:t>
-      </w:r>
-    </w:p>
-    <w:p>
-      <w:pPr>
-        <w:rPr>
-          <w:rFonts w:ascii="Arial" w:eastAsiaTheme="minorEastAsia" w:hAnsi="Arial" w:cs="Arial"/>
-          <w:sz w:val="26"/>
-          <w:szCs w:val="26"/>
-        </w:rPr>
-      </w:pPr>
-      <w:r>
-        <w:rPr>
-          <w:rFonts w:ascii="Arial" w:eastAsiaTheme="minorEastAsia" w:hAnsi="Arial" w:cs="Arial"/>
-          <w:sz w:val="26"/>
-          <w:szCs w:val="26"/>
-        </w:rPr>
         <w:t>Sample 2</w:t>
       </w:r>
     </w:p>
@@ -3328,6 +4086,30 @@
           <w:szCs w:val="26"/>
           <w:u w:val="single"/>
         </w:rPr>
+        <w:br w:type="page"/>
+      </w:r>
+    </w:p>
+    <w:p>
+      <w:pPr>
+        <w:rPr>
+          <w:rFonts w:ascii="Arial" w:eastAsiaTheme="minorEastAsia" w:hAnsi="Arial" w:cs="Arial"/>
+          <w:b/>
+          <w:bCs/>
+          <w:sz w:val="26"/>
+          <w:szCs w:val="26"/>
+          <w:u w:val="single"/>
+        </w:rPr>
+      </w:pPr>
+      <w:r>
+        <w:rPr>
+          <w:rFonts w:ascii="Arial" w:eastAsiaTheme="minorEastAsia" w:hAnsi="Arial" w:cs="Arial"/>
+          <w:b/>
+          <w:bCs/>
+          <w:sz w:val="26"/>
+          <w:szCs w:val="26"/>
+          <w:u w:val="single"/>
+        </w:rPr>
+        <w:lastRenderedPageBreak/>
         <w:t>Quick Reference</w:t>
       </w:r>
     </w:p>
@@ -3956,7 +4738,6 @@
           <w:szCs w:val="26"/>
           <w:u w:val="single"/>
         </w:rPr>
-        <w:lastRenderedPageBreak/>
         <w:t>Parameters</w:t>
       </w:r>
     </w:p>
@@ -4077,6 +4858,30 @@
           <w:szCs w:val="26"/>
           <w:u w:val="single"/>
         </w:rPr>
+        <w:br w:type="page"/>
+      </w:r>
+    </w:p>
+    <w:p>
+      <w:pPr>
+        <w:rPr>
+          <w:rFonts w:ascii="Arial" w:eastAsiaTheme="minorEastAsia" w:hAnsi="Arial" w:cs="Arial"/>
+          <w:b/>
+          <w:bCs/>
+          <w:sz w:val="26"/>
+          <w:szCs w:val="26"/>
+          <w:u w:val="single"/>
+        </w:rPr>
+      </w:pPr>
+      <w:r>
+        <w:rPr>
+          <w:rFonts w:ascii="Arial" w:eastAsiaTheme="minorEastAsia" w:hAnsi="Arial" w:cs="Arial"/>
+          <w:b/>
+          <w:bCs/>
+          <w:sz w:val="26"/>
+          <w:szCs w:val="26"/>
+          <w:u w:val="single"/>
+        </w:rPr>
+        <w:lastRenderedPageBreak/>
         <w:t>Key Papers</w:t>
       </w:r>
     </w:p>
@@ -4515,7 +5320,6 @@
           <w:sz w:val="26"/>
           <w:szCs w:val="26"/>
         </w:rPr>
-        <w:lastRenderedPageBreak/>
         <w:t>Relevance:</w:t>
       </w:r>
       <w:r>
@@ -4601,6 +5405,7 @@
           <w:sz w:val="26"/>
           <w:szCs w:val="26"/>
         </w:rPr>
+        <w:lastRenderedPageBreak/>
         <w:t xml:space="preserve">J. Adebayo, J. Gilmer, M. </w:t>
       </w:r>
       <w:proofErr w:type="spellStart"/>
@@ -4878,16 +5683,7 @@
           <w:sz w:val="26"/>
           <w:szCs w:val="26"/>
         </w:rPr>
-        <w:t xml:space="preserve"> This paper highlights the instability of saliency methods, showing that simple input transformations can significantly affect saliency maps without </w:t>
-      </w:r>
-      <w:r>
-        <w:rPr>
-          <w:rFonts w:ascii="Arial" w:eastAsiaTheme="minorEastAsia" w:hAnsi="Arial" w:cs="Arial"/>
-          <w:sz w:val="26"/>
-          <w:szCs w:val="26"/>
-        </w:rPr>
-        <w:lastRenderedPageBreak/>
-        <w:t xml:space="preserve">affecting the predictions of the model. It is relevant to the project as it </w:t>
+        <w:t xml:space="preserve"> This paper highlights the instability of saliency methods, showing that simple input transformations can significantly affect saliency maps without affecting the predictions of the model. It is relevant to the project as it </w:t>
       </w:r>
       <w:proofErr w:type="gramStart"/>
       <w:r>
@@ -4950,6 +5746,7 @@
           <w:sz w:val="26"/>
           <w:szCs w:val="26"/>
         </w:rPr>
+        <w:lastRenderedPageBreak/>
         <w:t xml:space="preserve">M. Du, N. Liu, and X. Hu, “Techniques for Interpretable Machine Learning,” arXiv:1808.00033 [cs, stat], May 2019, Available: </w:t>
       </w:r>
       <w:hyperlink r:id="rId8" w:history="1">
@@ -5073,6 +5870,666 @@
         </w:rPr>
         <w:t>the importance of interpretability and situate input gradient methods among other approaches. It also supports comparisons and discussions about when saliency methods are appropriate to use.</w:t>
       </w:r>
+    </w:p>
+    <w:p>
+      <w:pPr>
+        <w:rPr>
+          <w:rFonts w:ascii="Arial" w:eastAsiaTheme="minorEastAsia" w:hAnsi="Arial" w:cs="Arial"/>
+          <w:i/>
+          <w:iCs/>
+          <w:sz w:val="26"/>
+          <w:szCs w:val="26"/>
+        </w:rPr>
+      </w:pPr>
+      <w:r>
+        <w:rPr>
+          <w:rFonts w:ascii="Arial" w:eastAsiaTheme="minorEastAsia" w:hAnsi="Arial" w:cs="Arial"/>
+          <w:i/>
+          <w:iCs/>
+          <w:sz w:val="26"/>
+          <w:szCs w:val="26"/>
+        </w:rPr>
+        <w:t xml:space="preserve">L. </w:t>
+      </w:r>
+      <w:proofErr w:type="spellStart"/>
+      <w:r>
+        <w:rPr>
+          <w:rFonts w:ascii="Arial" w:eastAsiaTheme="minorEastAsia" w:hAnsi="Arial" w:cs="Arial"/>
+          <w:i/>
+          <w:iCs/>
+          <w:sz w:val="26"/>
+          <w:szCs w:val="26"/>
+        </w:rPr>
+        <w:t>Itti</w:t>
+      </w:r>
+      <w:proofErr w:type="spellEnd"/>
+      <w:r>
+        <w:rPr>
+          <w:rFonts w:ascii="Arial" w:eastAsiaTheme="minorEastAsia" w:hAnsi="Arial" w:cs="Arial"/>
+          <w:i/>
+          <w:iCs/>
+          <w:sz w:val="26"/>
+          <w:szCs w:val="26"/>
+        </w:rPr>
+        <w:t xml:space="preserve">, C. Koch, and E. Niebur, “A model of saliency-based visual attention for rapid scene analysis,” IEEE Transactions on Pattern Analysis and Machine Intelligence, vol. 20, no. 11, pp. 1254–1259, 1998, </w:t>
+      </w:r>
+      <w:proofErr w:type="spellStart"/>
+      <w:r>
+        <w:rPr>
+          <w:rFonts w:ascii="Arial" w:eastAsiaTheme="minorEastAsia" w:hAnsi="Arial" w:cs="Arial"/>
+          <w:i/>
+          <w:iCs/>
+          <w:sz w:val="26"/>
+          <w:szCs w:val="26"/>
+        </w:rPr>
+        <w:t>doi</w:t>
+      </w:r>
+      <w:proofErr w:type="spellEnd"/>
+      <w:r>
+        <w:rPr>
+          <w:rFonts w:ascii="Arial" w:eastAsiaTheme="minorEastAsia" w:hAnsi="Arial" w:cs="Arial"/>
+          <w:i/>
+          <w:iCs/>
+          <w:sz w:val="26"/>
+          <w:szCs w:val="26"/>
+        </w:rPr>
+        <w:t xml:space="preserve">: </w:t>
+      </w:r>
+      <w:hyperlink r:id="rId9" w:history="1">
+        <w:r>
+          <w:rPr>
+            <w:rStyle w:val="Hyperlink"/>
+            <w:rFonts w:ascii="Arial" w:eastAsiaTheme="minorEastAsia" w:hAnsi="Arial" w:cs="Arial"/>
+            <w:i/>
+            <w:iCs/>
+            <w:sz w:val="26"/>
+            <w:szCs w:val="26"/>
+          </w:rPr>
+          <w:t>https://doi.org/10.1109/34.730558</w:t>
+        </w:r>
+      </w:hyperlink>
+      <w:r>
+        <w:rPr>
+          <w:rFonts w:ascii="Arial" w:eastAsiaTheme="minorEastAsia" w:hAnsi="Arial" w:cs="Arial"/>
+          <w:i/>
+          <w:iCs/>
+          <w:sz w:val="26"/>
+          <w:szCs w:val="26"/>
+        </w:rPr>
+        <w:t>.</w:t>
+      </w:r>
+    </w:p>
+    <w:p>
+      <w:pPr>
+        <w:rPr>
+          <w:rFonts w:ascii="Arial" w:eastAsiaTheme="minorEastAsia" w:hAnsi="Arial" w:cs="Arial"/>
+          <w:sz w:val="26"/>
+          <w:szCs w:val="26"/>
+        </w:rPr>
+      </w:pPr>
+      <w:r>
+        <w:rPr>
+          <w:rFonts w:ascii="Arial" w:eastAsiaTheme="minorEastAsia" w:hAnsi="Arial" w:cs="Arial"/>
+          <w:sz w:val="26"/>
+          <w:szCs w:val="26"/>
+        </w:rPr>
+        <w:t xml:space="preserve">In this paper, </w:t>
+      </w:r>
+      <w:proofErr w:type="spellStart"/>
+      <w:r>
+        <w:rPr>
+          <w:rFonts w:ascii="Arial" w:eastAsiaTheme="minorEastAsia" w:hAnsi="Arial" w:cs="Arial"/>
+          <w:sz w:val="26"/>
+          <w:szCs w:val="26"/>
+        </w:rPr>
+        <w:t>Itti</w:t>
+      </w:r>
+      <w:proofErr w:type="spellEnd"/>
+      <w:r>
+        <w:rPr>
+          <w:rFonts w:ascii="Arial" w:eastAsiaTheme="minorEastAsia" w:hAnsi="Arial" w:cs="Arial"/>
+          <w:sz w:val="26"/>
+          <w:szCs w:val="26"/>
+        </w:rPr>
+        <w:t xml:space="preserve"> et al. introduces a </w:t>
+      </w:r>
+      <w:r>
+        <w:rPr>
+          <w:rFonts w:ascii="Arial" w:eastAsiaTheme="minorEastAsia" w:hAnsi="Arial" w:cs="Arial"/>
+          <w:sz w:val="26"/>
+          <w:szCs w:val="26"/>
+        </w:rPr>
+        <w:t>biologically inspired</w:t>
+      </w:r>
+      <w:r>
+        <w:rPr>
+          <w:rFonts w:ascii="Arial" w:eastAsiaTheme="minorEastAsia" w:hAnsi="Arial" w:cs="Arial"/>
+          <w:sz w:val="26"/>
+          <w:szCs w:val="26"/>
+        </w:rPr>
+        <w:t xml:space="preserve"> computational framework</w:t>
+      </w:r>
+      <w:r>
+        <w:rPr>
+          <w:rFonts w:ascii="Arial" w:eastAsiaTheme="minorEastAsia" w:hAnsi="Arial" w:cs="Arial"/>
+          <w:sz w:val="26"/>
+          <w:szCs w:val="26"/>
+        </w:rPr>
+        <w:t xml:space="preserve"> for bottom-up visual attention. The main contribution of this paper is a system that </w:t>
+      </w:r>
+      <w:r>
+        <w:rPr>
+          <w:rFonts w:ascii="Arial" w:eastAsiaTheme="minorEastAsia" w:hAnsi="Arial" w:cs="Arial"/>
+          <w:sz w:val="26"/>
+          <w:szCs w:val="26"/>
+        </w:rPr>
+        <w:t>decomposes input into topographical feature maps—</w:t>
+      </w:r>
+      <w:r>
+        <w:rPr>
+          <w:rFonts w:ascii="Arial" w:eastAsiaTheme="minorEastAsia" w:hAnsi="Arial" w:cs="Arial"/>
+          <w:sz w:val="26"/>
+          <w:szCs w:val="26"/>
+        </w:rPr>
+        <w:t>colour</w:t>
+      </w:r>
+      <w:r>
+        <w:rPr>
+          <w:rFonts w:ascii="Arial" w:eastAsiaTheme="minorEastAsia" w:hAnsi="Arial" w:cs="Arial"/>
+          <w:sz w:val="26"/>
+          <w:szCs w:val="26"/>
+        </w:rPr>
+        <w:t xml:space="preserve">, intensity, and orientation—using multi-scale </w:t>
+      </w:r>
+      <w:r>
+        <w:rPr>
+          <w:rFonts w:ascii="Arial" w:eastAsiaTheme="minorEastAsia" w:hAnsi="Arial" w:cs="Arial"/>
+          <w:sz w:val="26"/>
+          <w:szCs w:val="26"/>
+        </w:rPr>
+        <w:t>centre</w:t>
+      </w:r>
+      <w:r>
+        <w:rPr>
+          <w:rFonts w:ascii="Arial" w:eastAsiaTheme="minorEastAsia" w:hAnsi="Arial" w:cs="Arial"/>
+          <w:sz w:val="26"/>
+          <w:szCs w:val="26"/>
+        </w:rPr>
+        <w:t>-surround operations to detect local discontinuities</w:t>
+      </w:r>
+      <w:r>
+        <w:rPr>
+          <w:rFonts w:ascii="Arial" w:eastAsiaTheme="minorEastAsia" w:hAnsi="Arial" w:cs="Arial"/>
+          <w:sz w:val="26"/>
+          <w:szCs w:val="26"/>
+        </w:rPr>
+        <w:t xml:space="preserve">. </w:t>
+      </w:r>
+      <w:r>
+        <w:rPr>
+          <w:rFonts w:ascii="Arial" w:eastAsiaTheme="minorEastAsia" w:hAnsi="Arial" w:cs="Arial"/>
+          <w:sz w:val="26"/>
+          <w:szCs w:val="26"/>
+        </w:rPr>
+        <w:t>These features are integrated into a single master saliency map through a unique normalization process that promotes conspicuous locations while suppressing nois</w:t>
+      </w:r>
+      <w:r>
+        <w:rPr>
+          <w:rFonts w:ascii="Arial" w:eastAsiaTheme="minorEastAsia" w:hAnsi="Arial" w:cs="Arial"/>
+          <w:sz w:val="26"/>
+          <w:szCs w:val="26"/>
+        </w:rPr>
+        <w:t xml:space="preserve">e. The model would sequentially select  </w:t>
+      </w:r>
+      <w:r>
+        <w:rPr>
+          <w:rFonts w:ascii="Arial" w:eastAsiaTheme="minorEastAsia" w:hAnsi="Arial" w:cs="Arial"/>
+          <w:sz w:val="26"/>
+          <w:szCs w:val="26"/>
+        </w:rPr>
+        <w:t xml:space="preserve">attended regions in order of decreasing saliency. This efficient approach successfully replicates human search </w:t>
+      </w:r>
+      <w:r>
+        <w:rPr>
+          <w:rFonts w:ascii="Arial" w:eastAsiaTheme="minorEastAsia" w:hAnsi="Arial" w:cs="Arial"/>
+          <w:sz w:val="26"/>
+          <w:szCs w:val="26"/>
+        </w:rPr>
+        <w:t>behaviour</w:t>
+      </w:r>
+      <w:r>
+        <w:rPr>
+          <w:rFonts w:ascii="Arial" w:eastAsiaTheme="minorEastAsia" w:hAnsi="Arial" w:cs="Arial"/>
+          <w:sz w:val="26"/>
+          <w:szCs w:val="26"/>
+        </w:rPr>
+        <w:t xml:space="preserve"> across synthetic and complex natural imagery</w:t>
+      </w:r>
+      <w:r>
+        <w:rPr>
+          <w:rFonts w:ascii="Arial" w:eastAsiaTheme="minorEastAsia" w:hAnsi="Arial" w:cs="Arial"/>
+          <w:sz w:val="26"/>
+          <w:szCs w:val="26"/>
+        </w:rPr>
+        <w:t>.</w:t>
+      </w:r>
+    </w:p>
+    <w:p>
+      <w:pPr>
+        <w:rPr>
+          <w:rFonts w:ascii="Arial" w:eastAsiaTheme="minorEastAsia" w:hAnsi="Arial" w:cs="Arial"/>
+          <w:sz w:val="26"/>
+          <w:szCs w:val="26"/>
+        </w:rPr>
+      </w:pPr>
+      <w:r>
+        <w:rPr>
+          <w:rFonts w:ascii="Arial" w:eastAsiaTheme="minorEastAsia" w:hAnsi="Arial" w:cs="Arial"/>
+          <w:b/>
+          <w:bCs/>
+          <w:sz w:val="26"/>
+          <w:szCs w:val="26"/>
+        </w:rPr>
+        <w:t>Relevance:</w:t>
+      </w:r>
+      <w:r>
+        <w:rPr>
+          <w:rFonts w:ascii="Arial" w:eastAsiaTheme="minorEastAsia" w:hAnsi="Arial" w:cs="Arial"/>
+          <w:sz w:val="26"/>
+          <w:szCs w:val="26"/>
+        </w:rPr>
+        <w:t xml:space="preserve"> This paper provides the conceptual origin of saliency and is relevant to the biological foundations section of the </w:t>
+      </w:r>
+      <w:r>
+        <w:rPr>
+          <w:rFonts w:ascii="Arial" w:eastAsiaTheme="minorEastAsia" w:hAnsi="Arial" w:cs="Arial"/>
+          <w:sz w:val="26"/>
+          <w:szCs w:val="26"/>
+        </w:rPr>
+        <w:t xml:space="preserve">study </w:t>
+      </w:r>
+      <w:r>
+        <w:rPr>
+          <w:rFonts w:ascii="Arial" w:eastAsiaTheme="minorEastAsia" w:hAnsi="Arial" w:cs="Arial"/>
+          <w:sz w:val="26"/>
+          <w:szCs w:val="26"/>
+        </w:rPr>
+        <w:t>notes.</w:t>
+      </w:r>
+    </w:p>
+    <w:p>
+      <w:pPr>
+        <w:rPr>
+          <w:rFonts w:ascii="Arial" w:eastAsiaTheme="minorEastAsia" w:hAnsi="Arial" w:cs="Arial"/>
+          <w:i/>
+          <w:iCs/>
+          <w:sz w:val="26"/>
+          <w:szCs w:val="26"/>
+        </w:rPr>
+      </w:pPr>
+      <w:r>
+        <w:rPr>
+          <w:rFonts w:ascii="Arial" w:eastAsiaTheme="minorEastAsia" w:hAnsi="Arial" w:cs="Arial"/>
+          <w:i/>
+          <w:iCs/>
+          <w:sz w:val="26"/>
+          <w:szCs w:val="26"/>
+        </w:rPr>
+        <w:t xml:space="preserve">L. </w:t>
+      </w:r>
+      <w:proofErr w:type="spellStart"/>
+      <w:r>
+        <w:rPr>
+          <w:rFonts w:ascii="Arial" w:eastAsiaTheme="minorEastAsia" w:hAnsi="Arial" w:cs="Arial"/>
+          <w:i/>
+          <w:iCs/>
+          <w:sz w:val="26"/>
+          <w:szCs w:val="26"/>
+        </w:rPr>
+        <w:t>Itti</w:t>
+      </w:r>
+      <w:proofErr w:type="spellEnd"/>
+      <w:r>
+        <w:rPr>
+          <w:rFonts w:ascii="Arial" w:eastAsiaTheme="minorEastAsia" w:hAnsi="Arial" w:cs="Arial"/>
+          <w:i/>
+          <w:iCs/>
+          <w:sz w:val="26"/>
+          <w:szCs w:val="26"/>
+        </w:rPr>
+        <w:t xml:space="preserve"> and C. Koch, “A saliency-based search mechanism for overt and covert shifts of visual attention,” Vision Research, vol. 40, no. 10–12, pp. 1489–1506, Jun. 2000, </w:t>
+      </w:r>
+      <w:proofErr w:type="spellStart"/>
+      <w:r>
+        <w:rPr>
+          <w:rFonts w:ascii="Arial" w:eastAsiaTheme="minorEastAsia" w:hAnsi="Arial" w:cs="Arial"/>
+          <w:i/>
+          <w:iCs/>
+          <w:sz w:val="26"/>
+          <w:szCs w:val="26"/>
+        </w:rPr>
+        <w:t>doi</w:t>
+      </w:r>
+      <w:proofErr w:type="spellEnd"/>
+      <w:r>
+        <w:rPr>
+          <w:rFonts w:ascii="Arial" w:eastAsiaTheme="minorEastAsia" w:hAnsi="Arial" w:cs="Arial"/>
+          <w:i/>
+          <w:iCs/>
+          <w:sz w:val="26"/>
+          <w:szCs w:val="26"/>
+        </w:rPr>
+        <w:t xml:space="preserve">: </w:t>
+      </w:r>
+      <w:hyperlink r:id="rId10" w:history="1">
+        <w:r>
+          <w:rPr>
+            <w:rStyle w:val="Hyperlink"/>
+            <w:rFonts w:ascii="Arial" w:eastAsiaTheme="minorEastAsia" w:hAnsi="Arial" w:cs="Arial"/>
+            <w:i/>
+            <w:iCs/>
+            <w:sz w:val="26"/>
+            <w:szCs w:val="26"/>
+          </w:rPr>
+          <w:t>https://doi.org/10.1016/s0042-6989(99)00163-7</w:t>
+        </w:r>
+      </w:hyperlink>
+      <w:r>
+        <w:rPr>
+          <w:rFonts w:ascii="Arial" w:eastAsiaTheme="minorEastAsia" w:hAnsi="Arial" w:cs="Arial"/>
+          <w:i/>
+          <w:iCs/>
+          <w:sz w:val="26"/>
+          <w:szCs w:val="26"/>
+        </w:rPr>
+        <w:t>.</w:t>
+      </w:r>
+    </w:p>
+    <w:p>
+      <w:pPr>
+        <w:rPr>
+          <w:rFonts w:ascii="Arial" w:eastAsiaTheme="minorEastAsia" w:hAnsi="Arial" w:cs="Arial"/>
+          <w:sz w:val="26"/>
+          <w:szCs w:val="26"/>
+        </w:rPr>
+      </w:pPr>
+      <w:r>
+        <w:rPr>
+          <w:rFonts w:ascii="Arial" w:eastAsiaTheme="minorEastAsia" w:hAnsi="Arial" w:cs="Arial"/>
+          <w:sz w:val="26"/>
+          <w:szCs w:val="26"/>
+        </w:rPr>
+        <w:lastRenderedPageBreak/>
+        <w:t xml:space="preserve">In this paper, </w:t>
+      </w:r>
+      <w:proofErr w:type="spellStart"/>
+      <w:r>
+        <w:rPr>
+          <w:rFonts w:ascii="Arial" w:eastAsiaTheme="minorEastAsia" w:hAnsi="Arial" w:cs="Arial"/>
+          <w:sz w:val="26"/>
+          <w:szCs w:val="26"/>
+        </w:rPr>
+        <w:t>Itti</w:t>
+      </w:r>
+      <w:proofErr w:type="spellEnd"/>
+      <w:r>
+        <w:rPr>
+          <w:rFonts w:ascii="Arial" w:eastAsiaTheme="minorEastAsia" w:hAnsi="Arial" w:cs="Arial"/>
+          <w:sz w:val="26"/>
+          <w:szCs w:val="26"/>
+        </w:rPr>
+        <w:t xml:space="preserve"> and Koch provide a detailed computational implementation for </w:t>
+      </w:r>
+      <w:r>
+        <w:rPr>
+          <w:rFonts w:ascii="Arial" w:eastAsiaTheme="minorEastAsia" w:hAnsi="Arial" w:cs="Arial"/>
+          <w:sz w:val="26"/>
+          <w:szCs w:val="26"/>
+        </w:rPr>
+        <w:t>bottom-up attentional selection</w:t>
+      </w:r>
+      <w:r>
+        <w:rPr>
+          <w:rFonts w:ascii="Arial" w:eastAsiaTheme="minorEastAsia" w:hAnsi="Arial" w:cs="Arial"/>
+          <w:sz w:val="26"/>
+          <w:szCs w:val="26"/>
+        </w:rPr>
+        <w:t xml:space="preserve">. The main contribution of this paper is a </w:t>
+      </w:r>
+      <w:r>
+        <w:rPr>
+          <w:rFonts w:ascii="Arial" w:eastAsiaTheme="minorEastAsia" w:hAnsi="Arial" w:cs="Arial"/>
+          <w:sz w:val="26"/>
+          <w:szCs w:val="26"/>
+        </w:rPr>
+        <w:t>within-feature spatial competition scheme</w:t>
+      </w:r>
+      <w:r>
+        <w:rPr>
+          <w:rFonts w:ascii="Arial" w:eastAsiaTheme="minorEastAsia" w:hAnsi="Arial" w:cs="Arial"/>
+          <w:sz w:val="26"/>
+          <w:szCs w:val="26"/>
+        </w:rPr>
+        <w:t xml:space="preserve"> that is inspired by </w:t>
+      </w:r>
+      <w:r>
+        <w:rPr>
+          <w:rFonts w:ascii="Arial" w:eastAsiaTheme="minorEastAsia" w:hAnsi="Arial" w:cs="Arial"/>
+          <w:sz w:val="26"/>
+          <w:szCs w:val="26"/>
+        </w:rPr>
+        <w:t>non-classical neural interactions</w:t>
+      </w:r>
+      <w:r>
+        <w:rPr>
+          <w:rFonts w:ascii="Arial" w:eastAsiaTheme="minorEastAsia" w:hAnsi="Arial" w:cs="Arial"/>
+          <w:sz w:val="26"/>
+          <w:szCs w:val="26"/>
+        </w:rPr>
+        <w:t xml:space="preserve">. This paper solves the challenge of integrating </w:t>
+      </w:r>
+      <w:r>
+        <w:rPr>
+          <w:rFonts w:ascii="Arial" w:eastAsiaTheme="minorEastAsia" w:hAnsi="Arial" w:cs="Arial"/>
+          <w:sz w:val="26"/>
+          <w:szCs w:val="26"/>
+        </w:rPr>
+        <w:t>42 disparate feature maps (</w:t>
+      </w:r>
+      <w:proofErr w:type="spellStart"/>
+      <w:r>
+        <w:rPr>
+          <w:rFonts w:ascii="Arial" w:eastAsiaTheme="minorEastAsia" w:hAnsi="Arial" w:cs="Arial"/>
+          <w:sz w:val="26"/>
+          <w:szCs w:val="26"/>
+        </w:rPr>
+        <w:t>color</w:t>
+      </w:r>
+      <w:proofErr w:type="spellEnd"/>
+      <w:r>
+        <w:rPr>
+          <w:rFonts w:ascii="Arial" w:eastAsiaTheme="minorEastAsia" w:hAnsi="Arial" w:cs="Arial"/>
+          <w:sz w:val="26"/>
+          <w:szCs w:val="26"/>
+        </w:rPr>
+        <w:t>, intensity, orientation) into a single saliency map</w:t>
+      </w:r>
+      <w:r>
+        <w:rPr>
+          <w:rFonts w:ascii="Arial" w:eastAsiaTheme="minorEastAsia" w:hAnsi="Arial" w:cs="Arial"/>
+          <w:sz w:val="26"/>
+          <w:szCs w:val="26"/>
+        </w:rPr>
+        <w:t xml:space="preserve">. By iteratively </w:t>
+      </w:r>
+      <w:r>
+        <w:rPr>
+          <w:rFonts w:ascii="Arial" w:eastAsiaTheme="minorEastAsia" w:hAnsi="Arial" w:cs="Arial"/>
+          <w:sz w:val="26"/>
+          <w:szCs w:val="26"/>
+        </w:rPr>
+        <w:t>applying Difference-of-Gaussians (</w:t>
+      </w:r>
+      <w:proofErr w:type="spellStart"/>
+      <w:r>
+        <w:rPr>
+          <w:rFonts w:ascii="Arial" w:eastAsiaTheme="minorEastAsia" w:hAnsi="Arial" w:cs="Arial"/>
+          <w:sz w:val="26"/>
+          <w:szCs w:val="26"/>
+        </w:rPr>
+        <w:t>DoG</w:t>
+      </w:r>
+      <w:proofErr w:type="spellEnd"/>
+      <w:r>
+        <w:rPr>
+          <w:rFonts w:ascii="Arial" w:eastAsiaTheme="minorEastAsia" w:hAnsi="Arial" w:cs="Arial"/>
+          <w:sz w:val="26"/>
+          <w:szCs w:val="26"/>
+        </w:rPr>
+        <w:t>) filtering</w:t>
+      </w:r>
+      <w:r>
+        <w:rPr>
+          <w:rFonts w:ascii="Arial" w:eastAsiaTheme="minorEastAsia" w:hAnsi="Arial" w:cs="Arial"/>
+          <w:sz w:val="26"/>
+          <w:szCs w:val="26"/>
+        </w:rPr>
+        <w:t xml:space="preserve">, the system improves the </w:t>
+      </w:r>
+      <w:r>
+        <w:rPr>
+          <w:rFonts w:ascii="Arial" w:eastAsiaTheme="minorEastAsia" w:hAnsi="Arial" w:cs="Arial"/>
+          <w:sz w:val="26"/>
+          <w:szCs w:val="26"/>
+        </w:rPr>
+        <w:t>isolated conspicuous peaks while suppressing uniform background noise</w:t>
+      </w:r>
+      <w:r>
+        <w:rPr>
+          <w:rFonts w:ascii="Arial" w:eastAsiaTheme="minorEastAsia" w:hAnsi="Arial" w:cs="Arial"/>
+          <w:sz w:val="26"/>
+          <w:szCs w:val="26"/>
+        </w:rPr>
+        <w:t xml:space="preserve">. The model successfully </w:t>
+      </w:r>
+      <w:r>
+        <w:rPr>
+          <w:rFonts w:ascii="Arial" w:eastAsiaTheme="minorEastAsia" w:hAnsi="Arial" w:cs="Arial"/>
+          <w:sz w:val="26"/>
+          <w:szCs w:val="26"/>
+        </w:rPr>
+        <w:t xml:space="preserve">replicates human psychophysical search </w:t>
+      </w:r>
+      <w:proofErr w:type="spellStart"/>
+      <w:r>
+        <w:rPr>
+          <w:rFonts w:ascii="Arial" w:eastAsiaTheme="minorEastAsia" w:hAnsi="Arial" w:cs="Arial"/>
+          <w:sz w:val="26"/>
+          <w:szCs w:val="26"/>
+        </w:rPr>
+        <w:t>behavior</w:t>
+      </w:r>
+      <w:proofErr w:type="spellEnd"/>
+      <w:r>
+        <w:rPr>
+          <w:rFonts w:ascii="Arial" w:eastAsiaTheme="minorEastAsia" w:hAnsi="Arial" w:cs="Arial"/>
+          <w:sz w:val="26"/>
+          <w:szCs w:val="26"/>
+        </w:rPr>
+        <w:t xml:space="preserve"> and outperforms human observers in detecting camouflaged targets in high-resolution natural scenes</w:t>
+      </w:r>
+      <w:r>
+        <w:rPr>
+          <w:rFonts w:ascii="Arial" w:eastAsiaTheme="minorEastAsia" w:hAnsi="Arial" w:cs="Arial"/>
+          <w:sz w:val="26"/>
+          <w:szCs w:val="26"/>
+        </w:rPr>
+        <w:t>.</w:t>
+      </w:r>
+    </w:p>
+    <w:p>
+      <w:pPr>
+        <w:rPr>
+          <w:rFonts w:ascii="Arial" w:eastAsiaTheme="minorEastAsia" w:hAnsi="Arial" w:cs="Arial"/>
+          <w:sz w:val="26"/>
+          <w:szCs w:val="26"/>
+        </w:rPr>
+      </w:pPr>
+      <w:r>
+        <w:rPr>
+          <w:rFonts w:ascii="Arial" w:eastAsiaTheme="minorEastAsia" w:hAnsi="Arial" w:cs="Arial"/>
+          <w:b/>
+          <w:bCs/>
+          <w:sz w:val="26"/>
+          <w:szCs w:val="26"/>
+        </w:rPr>
+        <w:t>Relevance:</w:t>
+      </w:r>
+      <w:r>
+        <w:rPr>
+          <w:rFonts w:ascii="Arial" w:eastAsiaTheme="minorEastAsia" w:hAnsi="Arial" w:cs="Arial"/>
+          <w:sz w:val="26"/>
+          <w:szCs w:val="26"/>
+        </w:rPr>
+        <w:t xml:space="preserve"> </w:t>
+      </w:r>
+      <w:r>
+        <w:rPr>
+          <w:rFonts w:ascii="Arial" w:eastAsiaTheme="minorEastAsia" w:hAnsi="Arial" w:cs="Arial"/>
+          <w:sz w:val="26"/>
+          <w:szCs w:val="26"/>
+        </w:rPr>
+        <w:t xml:space="preserve">This paper </w:t>
+      </w:r>
+      <w:r>
+        <w:rPr>
+          <w:rFonts w:ascii="Arial" w:eastAsiaTheme="minorEastAsia" w:hAnsi="Arial" w:cs="Arial"/>
+          <w:sz w:val="26"/>
+          <w:szCs w:val="26"/>
+        </w:rPr>
+        <w:t xml:space="preserve">links saliency with attention mechanisms and perception and is relevant to the </w:t>
+      </w:r>
+      <w:r>
+        <w:rPr>
+          <w:rFonts w:ascii="Arial" w:eastAsiaTheme="minorEastAsia" w:hAnsi="Arial" w:cs="Arial"/>
+          <w:sz w:val="26"/>
+          <w:szCs w:val="26"/>
+        </w:rPr>
+        <w:t xml:space="preserve">biological foundations section of the </w:t>
+      </w:r>
+      <w:r>
+        <w:rPr>
+          <w:rFonts w:ascii="Arial" w:eastAsiaTheme="minorEastAsia" w:hAnsi="Arial" w:cs="Arial"/>
+          <w:sz w:val="26"/>
+          <w:szCs w:val="26"/>
+        </w:rPr>
+        <w:t xml:space="preserve">study </w:t>
+      </w:r>
+      <w:r>
+        <w:rPr>
+          <w:rFonts w:ascii="Arial" w:eastAsiaTheme="minorEastAsia" w:hAnsi="Arial" w:cs="Arial"/>
+          <w:sz w:val="26"/>
+          <w:szCs w:val="26"/>
+        </w:rPr>
+        <w:t>notes</w:t>
+      </w:r>
+      <w:r>
+        <w:rPr>
+          <w:rFonts w:ascii="Arial" w:eastAsiaTheme="minorEastAsia" w:hAnsi="Arial" w:cs="Arial"/>
+          <w:sz w:val="26"/>
+          <w:szCs w:val="26"/>
+        </w:rPr>
+        <w:t>.</w:t>
+      </w:r>
+    </w:p>
+    <w:p>
+      <w:pPr>
+        <w:rPr>
+          <w:rFonts w:ascii="Arial" w:eastAsiaTheme="minorEastAsia" w:hAnsi="Arial" w:cs="Arial"/>
+          <w:sz w:val="26"/>
+          <w:szCs w:val="26"/>
+        </w:rPr>
+      </w:pPr>
     </w:p>
     <w:p>
       <w:pPr>
@@ -6658,7 +8115,6 @@
   <w:style w:type="character" w:default="1" w:styleId="DefaultParagraphFont">
     <w:name w:val="Default Paragraph Font"/>
     <w:uiPriority w:val="1"/>
-    <w:semiHidden/>
     <w:unhideWhenUsed/>
   </w:style>
   <w:style w:type="table" w:default="1" w:styleId="TableNormal">

</xml_diff>

<commit_message>
3rd Version of Study Notes
</commit_message>
<xml_diff>
--- a/Study Notes.docx
+++ b/Study Notes.docx
@@ -130,7 +130,49 @@
           <w:sz w:val="26"/>
           <w:szCs w:val="26"/>
         </w:rPr>
-        <w:t>Deep neural networks, especially those in the field of computer vision, have achieved very strong performances in tasks such as image classification, object detection and medical diagnosis</w:t>
+        <w:t xml:space="preserve">Deep neural networks, especially those </w:t>
+      </w:r>
+      <w:r>
+        <w:rPr>
+          <w:sz w:val="26"/>
+          <w:szCs w:val="26"/>
+        </w:rPr>
+        <w:t>that exist in</w:t>
+      </w:r>
+      <w:r>
+        <w:rPr>
+          <w:sz w:val="26"/>
+          <w:szCs w:val="26"/>
+        </w:rPr>
+        <w:t xml:space="preserve"> computer vision, have achieved very strong performances in </w:t>
+      </w:r>
+      <w:r>
+        <w:rPr>
+          <w:sz w:val="26"/>
+          <w:szCs w:val="26"/>
+        </w:rPr>
+        <w:t xml:space="preserve">multiple </w:t>
+      </w:r>
+      <w:r>
+        <w:rPr>
+          <w:sz w:val="26"/>
+          <w:szCs w:val="26"/>
+        </w:rPr>
+        <w:t xml:space="preserve">tasks </w:t>
+      </w:r>
+      <w:r>
+        <w:rPr>
+          <w:sz w:val="26"/>
+          <w:szCs w:val="26"/>
+        </w:rPr>
+        <w:t xml:space="preserve">including </w:t>
+      </w:r>
+      <w:r>
+        <w:rPr>
+          <w:sz w:val="26"/>
+          <w:szCs w:val="26"/>
+        </w:rPr>
+        <w:t>image classification, object detection and medical diagnosis</w:t>
       </w:r>
       <w:r>
         <w:rPr>
@@ -151,24 +193,54 @@
           <w:sz w:val="26"/>
           <w:szCs w:val="26"/>
         </w:rPr>
-        <w:t xml:space="preserve"> This raises problems, especially in domains where</w:t>
-      </w:r>
-      <w:r>
         <w:t xml:space="preserve"> </w:t>
       </w:r>
-      <w:r>
-        <w:rPr>
-          <w:sz w:val="26"/>
-          <w:szCs w:val="26"/>
-        </w:rPr>
-        <w:t>understanding why</w:t>
-      </w:r>
+      <w:proofErr w:type="gramStart"/>
+      <w:r>
+        <w:rPr>
+          <w:sz w:val="26"/>
+          <w:szCs w:val="26"/>
+        </w:rPr>
+        <w:t>This raises</w:t>
+      </w:r>
+      <w:proofErr w:type="gramEnd"/>
       <w:r>
         <w:rPr>
           <w:sz w:val="26"/>
           <w:szCs w:val="26"/>
         </w:rPr>
         <w:t xml:space="preserve"> </w:t>
+      </w:r>
+      <w:r>
+        <w:rPr>
+          <w:sz w:val="26"/>
+          <w:szCs w:val="26"/>
+        </w:rPr>
+        <w:t>concerns</w:t>
+      </w:r>
+      <w:r>
+        <w:rPr>
+          <w:sz w:val="26"/>
+          <w:szCs w:val="26"/>
+        </w:rPr>
+        <w:t xml:space="preserve"> in domains where</w:t>
+      </w:r>
+      <w:r>
+        <w:t xml:space="preserve"> </w:t>
+      </w:r>
+      <w:r>
+        <w:rPr>
+          <w:sz w:val="26"/>
+          <w:szCs w:val="26"/>
+        </w:rPr>
+        <w:t xml:space="preserve">understanding </w:t>
+      </w:r>
+      <w:r>
+        <w:rPr>
+          <w:sz w:val="26"/>
+          <w:szCs w:val="26"/>
+        </w:rPr>
+        <w:t xml:space="preserve">how </w:t>
       </w:r>
       <w:r>
         <w:rPr>
@@ -555,21 +627,273 @@
           <w:sz w:val="26"/>
           <w:szCs w:val="26"/>
         </w:rPr>
-        <w:t>decomposed into multiple feature channels, including intensity, colour, and orientation. These features are analysed at different spatial scales to capture both fine and coarse visual structures. The model computes centre-surround contrasts, which measure how different a region is compared to its surroundings, producing feature maps that highlight areas of high visual contrast.</w:t>
-      </w:r>
-      <w:r>
-        <w:rPr>
-          <w:sz w:val="26"/>
-          <w:szCs w:val="26"/>
-        </w:rPr>
-        <w:t xml:space="preserve"> These feature maps are then combined into a single saliency map</w:t>
-      </w:r>
-      <w:r>
-        <w:rPr>
-          <w:sz w:val="26"/>
-          <w:szCs w:val="26"/>
-        </w:rPr>
-        <w:t>, where higher values correspond to regions that are more visually prominent.</w:t>
+        <w:t xml:space="preserve">decomposed into multiple feature channels, including intensity, colour, and orientation. </w:t>
+      </w:r>
+      <w:r>
+        <w:rPr>
+          <w:sz w:val="26"/>
+          <w:szCs w:val="26"/>
+        </w:rPr>
+        <w:t xml:space="preserve">The model would </w:t>
+      </w:r>
+      <w:r>
+        <w:rPr>
+          <w:sz w:val="26"/>
+          <w:szCs w:val="26"/>
+        </w:rPr>
+        <w:t>analyse</w:t>
+      </w:r>
+      <w:r>
+        <w:rPr>
+          <w:sz w:val="26"/>
+          <w:szCs w:val="26"/>
+        </w:rPr>
+        <w:t xml:space="preserve"> t</w:t>
+      </w:r>
+      <w:r>
+        <w:rPr>
+          <w:sz w:val="26"/>
+          <w:szCs w:val="26"/>
+        </w:rPr>
+        <w:t xml:space="preserve">hese features at different spatial </w:t>
+      </w:r>
+      <w:r>
+        <w:rPr>
+          <w:sz w:val="26"/>
+          <w:szCs w:val="26"/>
+        </w:rPr>
+        <w:t>dimensions</w:t>
+      </w:r>
+      <w:r>
+        <w:rPr>
+          <w:sz w:val="26"/>
+          <w:szCs w:val="26"/>
+        </w:rPr>
+        <w:t xml:space="preserve"> to capture both fine</w:t>
+      </w:r>
+      <w:r>
+        <w:rPr>
+          <w:sz w:val="26"/>
+          <w:szCs w:val="26"/>
+        </w:rPr>
+        <w:t xml:space="preserve"> details</w:t>
+      </w:r>
+      <w:r>
+        <w:rPr>
+          <w:sz w:val="26"/>
+          <w:szCs w:val="26"/>
+        </w:rPr>
+        <w:t xml:space="preserve"> and </w:t>
+      </w:r>
+      <w:r>
+        <w:rPr>
+          <w:sz w:val="26"/>
+          <w:szCs w:val="26"/>
+        </w:rPr>
+        <w:t xml:space="preserve">broader </w:t>
+      </w:r>
+      <w:r>
+        <w:rPr>
+          <w:sz w:val="26"/>
+          <w:szCs w:val="26"/>
+        </w:rPr>
+        <w:t xml:space="preserve">structures. </w:t>
+      </w:r>
+      <w:r>
+        <w:rPr>
+          <w:sz w:val="26"/>
+          <w:szCs w:val="26"/>
+        </w:rPr>
+        <w:t xml:space="preserve">By </w:t>
+      </w:r>
+      <w:r>
+        <w:rPr>
+          <w:sz w:val="26"/>
+          <w:szCs w:val="26"/>
+        </w:rPr>
+        <w:t xml:space="preserve">measuring </w:t>
+      </w:r>
+      <w:r>
+        <w:rPr>
+          <w:sz w:val="26"/>
+          <w:szCs w:val="26"/>
+        </w:rPr>
+        <w:t xml:space="preserve">centre-surround contrasts, </w:t>
+      </w:r>
+      <w:r>
+        <w:rPr>
+          <w:sz w:val="26"/>
+          <w:szCs w:val="26"/>
+        </w:rPr>
+        <w:t xml:space="preserve">the models </w:t>
+      </w:r>
+      <w:r>
+        <w:rPr>
+          <w:sz w:val="26"/>
+          <w:szCs w:val="26"/>
+        </w:rPr>
+        <w:t>identify exactly</w:t>
+      </w:r>
+      <w:r>
+        <w:rPr>
+          <w:sz w:val="26"/>
+          <w:szCs w:val="26"/>
+        </w:rPr>
+        <w:t xml:space="preserve"> how a region </w:t>
+      </w:r>
+      <w:r>
+        <w:rPr>
+          <w:sz w:val="26"/>
+          <w:szCs w:val="26"/>
+        </w:rPr>
+        <w:t xml:space="preserve">pops against </w:t>
+      </w:r>
+      <w:r>
+        <w:rPr>
+          <w:sz w:val="26"/>
+          <w:szCs w:val="26"/>
+        </w:rPr>
+        <w:t>its background</w:t>
+      </w:r>
+      <w:r>
+        <w:rPr>
+          <w:sz w:val="26"/>
+          <w:szCs w:val="26"/>
+        </w:rPr>
+        <w:t>. This data would produce</w:t>
+      </w:r>
+      <w:r>
+        <w:rPr>
+          <w:sz w:val="26"/>
+          <w:szCs w:val="26"/>
+        </w:rPr>
+        <w:t xml:space="preserve"> </w:t>
+      </w:r>
+      <w:r>
+        <w:rPr>
+          <w:sz w:val="26"/>
+          <w:szCs w:val="26"/>
+        </w:rPr>
+        <w:t xml:space="preserve">feature maps that </w:t>
+      </w:r>
+      <w:r>
+        <w:rPr>
+          <w:sz w:val="26"/>
+          <w:szCs w:val="26"/>
+        </w:rPr>
+        <w:t>showcase</w:t>
+      </w:r>
+      <w:r>
+        <w:rPr>
+          <w:sz w:val="26"/>
+          <w:szCs w:val="26"/>
+        </w:rPr>
+        <w:t xml:space="preserve"> high-contrast areas.</w:t>
+      </w:r>
+      <w:r>
+        <w:rPr>
+          <w:sz w:val="26"/>
+          <w:szCs w:val="26"/>
+        </w:rPr>
+        <w:t xml:space="preserve"> </w:t>
+      </w:r>
+      <w:r>
+        <w:rPr>
+          <w:sz w:val="26"/>
+          <w:szCs w:val="26"/>
+        </w:rPr>
+        <w:t>The model would then generate a final saliency map by combining these feature maps</w:t>
+      </w:r>
+      <w:r>
+        <w:rPr>
+          <w:sz w:val="26"/>
+          <w:szCs w:val="26"/>
+        </w:rPr>
+        <w:t xml:space="preserve">, </w:t>
+      </w:r>
+      <w:r>
+        <w:rPr>
+          <w:sz w:val="26"/>
+          <w:szCs w:val="26"/>
+        </w:rPr>
+        <w:t xml:space="preserve">with </w:t>
+      </w:r>
+      <w:r>
+        <w:rPr>
+          <w:sz w:val="26"/>
+          <w:szCs w:val="26"/>
+        </w:rPr>
+        <w:t>the highest</w:t>
+      </w:r>
+      <w:r>
+        <w:rPr>
+          <w:sz w:val="26"/>
+          <w:szCs w:val="26"/>
+        </w:rPr>
+        <w:t xml:space="preserve"> numerical</w:t>
+      </w:r>
+      <w:r>
+        <w:rPr>
+          <w:sz w:val="26"/>
+          <w:szCs w:val="26"/>
+        </w:rPr>
+        <w:t xml:space="preserve"> values</w:t>
+      </w:r>
+      <w:r>
+        <w:rPr>
+          <w:sz w:val="26"/>
+          <w:szCs w:val="26"/>
+        </w:rPr>
+        <w:t xml:space="preserve"> </w:t>
+      </w:r>
+      <w:r>
+        <w:rPr>
+          <w:sz w:val="26"/>
+          <w:szCs w:val="26"/>
+        </w:rPr>
+        <w:t>represent</w:t>
+      </w:r>
+      <w:r>
+        <w:rPr>
+          <w:sz w:val="26"/>
+          <w:szCs w:val="26"/>
+        </w:rPr>
+        <w:t>ing</w:t>
+      </w:r>
+      <w:r>
+        <w:rPr>
+          <w:sz w:val="26"/>
+          <w:szCs w:val="26"/>
+        </w:rPr>
+        <w:t xml:space="preserve"> </w:t>
+      </w:r>
+      <w:r>
+        <w:rPr>
+          <w:sz w:val="26"/>
+          <w:szCs w:val="26"/>
+        </w:rPr>
+        <w:t xml:space="preserve">the most </w:t>
+      </w:r>
+      <w:r>
+        <w:rPr>
+          <w:sz w:val="26"/>
+          <w:szCs w:val="26"/>
+        </w:rPr>
+        <w:t>visually dominant</w:t>
+      </w:r>
+      <w:r>
+        <w:rPr>
+          <w:sz w:val="26"/>
+          <w:szCs w:val="26"/>
+        </w:rPr>
+        <w:t xml:space="preserve"> </w:t>
+      </w:r>
+      <w:r>
+        <w:rPr>
+          <w:sz w:val="26"/>
+          <w:szCs w:val="26"/>
+        </w:rPr>
+        <w:t>regions.</w:t>
       </w:r>
       <w:r>
         <w:rPr>
@@ -753,7 +1077,91 @@
           <w:sz w:val="26"/>
           <w:szCs w:val="26"/>
         </w:rPr>
-        <w:t>In simple terms, an input gradient measures how much a tiny change in a specific pixel would change the network’s final confidence score. Imagine you are standing in front of a giant wall consisting of tiny dimmer switches, where each switch represents a pixel in an image. Somewhere else, there is a meter showing how confident the computer is deducing that the image is a cat. An input gradient is when you ask the question: “If I slowly push this tiny switch, how much will that Cat needle move?”</w:t>
+        <w:t>A</w:t>
+      </w:r>
+      <w:r>
+        <w:rPr>
+          <w:sz w:val="26"/>
+          <w:szCs w:val="26"/>
+        </w:rPr>
+        <w:t xml:space="preserve">n input gradient </w:t>
+      </w:r>
+      <w:r>
+        <w:rPr>
+          <w:sz w:val="26"/>
+          <w:szCs w:val="26"/>
+        </w:rPr>
+        <w:t xml:space="preserve">is a measure that </w:t>
+      </w:r>
+      <w:r>
+        <w:rPr>
+          <w:sz w:val="26"/>
+          <w:szCs w:val="26"/>
+        </w:rPr>
+        <w:t xml:space="preserve">represents the tiny changes </w:t>
+      </w:r>
+      <w:r>
+        <w:rPr>
+          <w:sz w:val="26"/>
+          <w:szCs w:val="26"/>
+        </w:rPr>
+        <w:t>in a specific pixel</w:t>
+      </w:r>
+      <w:r>
+        <w:rPr>
+          <w:sz w:val="26"/>
+          <w:szCs w:val="26"/>
+        </w:rPr>
+        <w:t xml:space="preserve"> which</w:t>
+      </w:r>
+      <w:r>
+        <w:rPr>
+          <w:sz w:val="26"/>
+          <w:szCs w:val="26"/>
+        </w:rPr>
+        <w:t xml:space="preserve"> </w:t>
+      </w:r>
+      <w:r>
+        <w:rPr>
+          <w:sz w:val="26"/>
+          <w:szCs w:val="26"/>
+        </w:rPr>
+        <w:t>can impact</w:t>
+      </w:r>
+      <w:r>
+        <w:rPr>
+          <w:sz w:val="26"/>
+          <w:szCs w:val="26"/>
+        </w:rPr>
+        <w:t xml:space="preserve"> the network’s final confidence score. Imagine standing in</w:t>
+      </w:r>
+      <w:r>
+        <w:rPr>
+          <w:sz w:val="26"/>
+          <w:szCs w:val="26"/>
+        </w:rPr>
+        <w:t xml:space="preserve"> a room in</w:t>
+      </w:r>
+      <w:r>
+        <w:rPr>
+          <w:sz w:val="26"/>
+          <w:szCs w:val="26"/>
+        </w:rPr>
+        <w:t xml:space="preserve"> front of a wall </w:t>
+      </w:r>
+      <w:r>
+        <w:rPr>
+          <w:sz w:val="26"/>
+          <w:szCs w:val="26"/>
+        </w:rPr>
+        <w:t xml:space="preserve">that contains multiple </w:t>
+      </w:r>
+      <w:r>
+        <w:rPr>
+          <w:sz w:val="26"/>
+          <w:szCs w:val="26"/>
+        </w:rPr>
+        <w:t>tiny dimmer switches, where each switch represents a pixel in an image. Somewhere else, there is a meter showing how confident the computer is deducing that the image is a cat. An input gradient is when you ask the question: “If I slowly push this tiny switch, how much will that Cat needle move?”</w:t>
       </w:r>
     </w:p>
     <w:p>
@@ -806,6 +1214,7 @@
           <w:sz w:val="26"/>
           <w:szCs w:val="26"/>
         </w:rPr>
+        <w:lastRenderedPageBreak/>
         <w:t xml:space="preserve">A saliency map (also known as a sensitivity or pixel attribution map) is the </w:t>
       </w:r>
       <w:r>
@@ -813,15 +1222,49 @@
           <w:sz w:val="26"/>
           <w:szCs w:val="26"/>
         </w:rPr>
-        <w:t xml:space="preserve">result of gathering all of the tiny “nudges” and displaying them as a single image. Think </w:t>
-      </w:r>
-      <w:r>
-        <w:rPr>
-          <w:sz w:val="26"/>
-          <w:szCs w:val="26"/>
-        </w:rPr>
-        <w:lastRenderedPageBreak/>
-        <w:t xml:space="preserve">of a saliency map as a heat-sensing camera for the AI’s brain. When the AI looks at a picture of a gazelle, the saliency maps highlight the important areas of the gazelle such as the horns and the ears. Through these hot spots, the AI can deduce that the image can be labelled as an image representing a gazelle. A saliency map can turn the mathematical importance of each pixel into a visual guide that humans can understand. For instance, </w:t>
+        <w:t xml:space="preserve">result of gathering all of the tiny “nudges” and displaying them as a single image. </w:t>
+      </w:r>
+      <w:r>
+        <w:rPr>
+          <w:sz w:val="26"/>
+          <w:szCs w:val="26"/>
+        </w:rPr>
+        <w:t xml:space="preserve">This map works in a similar way </w:t>
+      </w:r>
+      <w:r>
+        <w:rPr>
+          <w:sz w:val="26"/>
+          <w:szCs w:val="26"/>
+        </w:rPr>
+        <w:t>as a heat-sensing camera for the AI’s brain. When the AI looks at picture</w:t>
+      </w:r>
+      <w:r>
+        <w:rPr>
+          <w:sz w:val="26"/>
+          <w:szCs w:val="26"/>
+        </w:rPr>
+        <w:t>s</w:t>
+      </w:r>
+      <w:r>
+        <w:rPr>
+          <w:sz w:val="26"/>
+          <w:szCs w:val="26"/>
+        </w:rPr>
+        <w:t xml:space="preserve"> of a gazelle, the saliency maps </w:t>
+      </w:r>
+      <w:r>
+        <w:rPr>
+          <w:sz w:val="26"/>
+          <w:szCs w:val="26"/>
+        </w:rPr>
+        <w:t xml:space="preserve">would </w:t>
+      </w:r>
+      <w:r>
+        <w:rPr>
+          <w:sz w:val="26"/>
+          <w:szCs w:val="26"/>
+        </w:rPr>
+        <w:t xml:space="preserve">highlight important areas of the gazelle such as the horns and the ears. Through these hot spots, the AI can deduce that the image can be labelled as an image representing a gazelle. A saliency map can turn the mathematical importance of each pixel into a visual guide that humans can understand. For instance, </w:t>
       </w:r>
       <w:r>
         <w:rPr>
@@ -878,21 +1321,91 @@
           <w:sz w:val="26"/>
           <w:szCs w:val="26"/>
         </w:rPr>
-        <w:t xml:space="preserve">. It is like looking at a map through a cracked and blurry lens. </w:t>
-      </w:r>
-      <w:r>
-        <w:rPr>
-          <w:sz w:val="26"/>
-          <w:szCs w:val="26"/>
-        </w:rPr>
-        <w:t>You can see the general shape of the "hot spots," but there are random speckles everywhere</w:t>
-      </w:r>
-      <w:r>
-        <w:rPr>
-          <w:sz w:val="26"/>
-          <w:szCs w:val="26"/>
-        </w:rPr>
-        <w:t xml:space="preserve">. To solve this problem, methods such as </w:t>
+        <w:t xml:space="preserve">. </w:t>
+      </w:r>
+      <w:r>
+        <w:rPr>
+          <w:sz w:val="26"/>
+          <w:szCs w:val="26"/>
+        </w:rPr>
+        <w:t>This</w:t>
+      </w:r>
+      <w:r>
+        <w:rPr>
+          <w:sz w:val="26"/>
+          <w:szCs w:val="26"/>
+        </w:rPr>
+        <w:t xml:space="preserve"> is </w:t>
+      </w:r>
+      <w:r>
+        <w:rPr>
+          <w:sz w:val="26"/>
+          <w:szCs w:val="26"/>
+        </w:rPr>
+        <w:t>similar to</w:t>
+      </w:r>
+      <w:r>
+        <w:rPr>
+          <w:sz w:val="26"/>
+          <w:szCs w:val="26"/>
+        </w:rPr>
+        <w:t xml:space="preserve"> a high-precision tool reacting to the smallest disturbances. The core pattern still remains the same, but small and random </w:t>
+      </w:r>
+      <w:r>
+        <w:rPr>
+          <w:sz w:val="26"/>
+          <w:szCs w:val="26"/>
+        </w:rPr>
+        <w:t xml:space="preserve">fluctuations </w:t>
+      </w:r>
+      <w:r>
+        <w:rPr>
+          <w:sz w:val="26"/>
+          <w:szCs w:val="26"/>
+        </w:rPr>
+        <w:t xml:space="preserve">often </w:t>
+      </w:r>
+      <w:r>
+        <w:rPr>
+          <w:sz w:val="26"/>
+          <w:szCs w:val="26"/>
+        </w:rPr>
+        <w:t>create a lot of random noise in the readings.</w:t>
+      </w:r>
+      <w:r>
+        <w:rPr>
+          <w:sz w:val="26"/>
+          <w:szCs w:val="26"/>
+        </w:rPr>
+        <w:t xml:space="preserve"> </w:t>
+      </w:r>
+      <w:r>
+        <w:rPr>
+          <w:sz w:val="26"/>
+          <w:szCs w:val="26"/>
+        </w:rPr>
+        <w:t xml:space="preserve">To solve this problem, </w:t>
+      </w:r>
+      <w:r>
+        <w:rPr>
+          <w:sz w:val="26"/>
+          <w:szCs w:val="26"/>
+        </w:rPr>
+        <w:t xml:space="preserve">techniques </w:t>
+      </w:r>
+      <w:r>
+        <w:rPr>
+          <w:sz w:val="26"/>
+          <w:szCs w:val="26"/>
+        </w:rPr>
+        <w:t xml:space="preserve">such as </w:t>
+      </w:r>
+      <w:r>
+        <w:rPr>
+          <w:sz w:val="26"/>
+          <w:szCs w:val="26"/>
+        </w:rPr>
+        <w:t xml:space="preserve">the </w:t>
       </w:r>
       <w:proofErr w:type="spellStart"/>
       <w:r>
@@ -908,7 +1421,35 @@
           <w:sz w:val="26"/>
           <w:szCs w:val="26"/>
         </w:rPr>
-        <w:t xml:space="preserve"> can be implemented. This technique would take slightly different versions of the image by adding a bit of static or noise to each image. The gradients for all of the images are then calculated </w:t>
+        <w:t xml:space="preserve"> </w:t>
+      </w:r>
+      <w:r>
+        <w:rPr>
+          <w:sz w:val="26"/>
+          <w:szCs w:val="26"/>
+        </w:rPr>
+        <w:t xml:space="preserve">technique </w:t>
+      </w:r>
+      <w:r>
+        <w:rPr>
+          <w:sz w:val="26"/>
+          <w:szCs w:val="26"/>
+        </w:rPr>
+        <w:t>can be</w:t>
+      </w:r>
+      <w:r>
+        <w:rPr>
+          <w:sz w:val="26"/>
+          <w:szCs w:val="26"/>
+        </w:rPr>
+        <w:t xml:space="preserve"> used.</w:t>
+      </w:r>
+      <w:r>
+        <w:rPr>
+          <w:sz w:val="26"/>
+          <w:szCs w:val="26"/>
+        </w:rPr>
+        <w:t xml:space="preserve"> This technique would take slightly different versions of the image by adding a bit of static or noise to each image. The gradients for all of the images are then calculated </w:t>
       </w:r>
       <w:r>
         <w:rPr>
@@ -944,14 +1485,21 @@
           <w:sz w:val="26"/>
           <w:szCs w:val="26"/>
         </w:rPr>
-        <w:t xml:space="preserve">Saliency Maps and Input Gradients are important for a network’s decision making as it can help developers debug models. For example, if a self-driving car </w:t>
-      </w:r>
-      <w:r>
-        <w:rPr>
-          <w:sz w:val="26"/>
-          <w:szCs w:val="26"/>
-        </w:rPr>
-        <w:t>fails to brake for a fire</w:t>
+        <w:t xml:space="preserve">Saliency Maps and Input Gradients are important for a network’s decision making as it can help developers debug models. </w:t>
+      </w:r>
+      <w:r>
+        <w:rPr>
+          <w:sz w:val="26"/>
+          <w:szCs w:val="26"/>
+        </w:rPr>
+        <w:t>If a</w:t>
+      </w:r>
+      <w:r>
+        <w:rPr>
+          <w:sz w:val="26"/>
+          <w:szCs w:val="26"/>
+        </w:rPr>
+        <w:t xml:space="preserve"> self-driving car</w:t>
       </w:r>
       <w:r>
         <w:rPr>
@@ -965,14 +1513,105 @@
           <w:sz w:val="26"/>
           <w:szCs w:val="26"/>
         </w:rPr>
-        <w:t>truck, a saliency map could reveal if the AI was actually "looking" at the truck or was distracted by a bright sign on the side of the road</w:t>
-      </w:r>
-      <w:r>
-        <w:rPr>
-          <w:sz w:val="26"/>
-          <w:szCs w:val="26"/>
-        </w:rPr>
-        <w:t>. By identifying the pixels that carry the most weight, we can make sure that the model is learning the correct rules instead of finding shortcuts.</w:t>
+        <w:t>forgets to stop in front of</w:t>
+      </w:r>
+      <w:r>
+        <w:rPr>
+          <w:sz w:val="26"/>
+          <w:szCs w:val="26"/>
+        </w:rPr>
+        <w:t xml:space="preserve"> a fire</w:t>
+      </w:r>
+      <w:r>
+        <w:rPr>
+          <w:sz w:val="26"/>
+          <w:szCs w:val="26"/>
+        </w:rPr>
+        <w:t xml:space="preserve"> </w:t>
+      </w:r>
+      <w:r>
+        <w:rPr>
+          <w:sz w:val="26"/>
+          <w:szCs w:val="26"/>
+        </w:rPr>
+        <w:t xml:space="preserve">truck, a saliency map </w:t>
+      </w:r>
+      <w:r>
+        <w:rPr>
+          <w:sz w:val="26"/>
+          <w:szCs w:val="26"/>
+        </w:rPr>
+        <w:t xml:space="preserve">can check if it was focused on the vehicle or on a bright sign </w:t>
+      </w:r>
+      <w:r>
+        <w:rPr>
+          <w:sz w:val="26"/>
+          <w:szCs w:val="26"/>
+        </w:rPr>
+        <w:t>on the side of the road</w:t>
+      </w:r>
+      <w:r>
+        <w:rPr>
+          <w:sz w:val="26"/>
+          <w:szCs w:val="26"/>
+        </w:rPr>
+        <w:t xml:space="preserve">. By </w:t>
+      </w:r>
+      <w:r>
+        <w:rPr>
+          <w:sz w:val="26"/>
+          <w:szCs w:val="26"/>
+        </w:rPr>
+        <w:t>highlighting the important</w:t>
+      </w:r>
+      <w:r>
+        <w:rPr>
+          <w:sz w:val="26"/>
+          <w:szCs w:val="26"/>
+        </w:rPr>
+        <w:t xml:space="preserve"> pixels, </w:t>
+      </w:r>
+      <w:r>
+        <w:rPr>
+          <w:sz w:val="26"/>
+          <w:szCs w:val="26"/>
+        </w:rPr>
+        <w:t>the saliency map</w:t>
+      </w:r>
+      <w:r>
+        <w:rPr>
+          <w:sz w:val="26"/>
+          <w:szCs w:val="26"/>
+        </w:rPr>
+        <w:t xml:space="preserve"> can </w:t>
+      </w:r>
+      <w:r>
+        <w:rPr>
+          <w:sz w:val="26"/>
+          <w:szCs w:val="26"/>
+        </w:rPr>
+        <w:t>verify whether the model is following th</w:t>
+      </w:r>
+      <w:r>
+        <w:rPr>
+          <w:sz w:val="26"/>
+          <w:szCs w:val="26"/>
+        </w:rPr>
+        <w:t xml:space="preserve">e correct rules instead of </w:t>
+      </w:r>
+      <w:r>
+        <w:rPr>
+          <w:sz w:val="26"/>
+          <w:szCs w:val="26"/>
+        </w:rPr>
+        <w:t xml:space="preserve">taking </w:t>
+      </w:r>
+      <w:r>
+        <w:rPr>
+          <w:sz w:val="26"/>
+          <w:szCs w:val="26"/>
+        </w:rPr>
+        <w:t>shortcuts.</w:t>
       </w:r>
     </w:p>
     <w:p>
@@ -1171,6 +1810,7 @@
           <w:sz w:val="26"/>
           <w:szCs w:val="26"/>
         </w:rPr>
+        <w:lastRenderedPageBreak/>
         <w:t>The algorithm for a vanilla saliency map works as follows</w:t>
       </w:r>
     </w:p>
@@ -1191,7 +1831,6 @@
           <w:sz w:val="26"/>
           <w:szCs w:val="26"/>
         </w:rPr>
-        <w:lastRenderedPageBreak/>
         <w:t xml:space="preserve">A forward pass </w:t>
       </w:r>
       <w:r>
@@ -5999,15 +6638,7 @@
           <w:sz w:val="26"/>
           <w:szCs w:val="26"/>
         </w:rPr>
-        <w:t>biologically inspired</w:t>
-      </w:r>
-      <w:r>
-        <w:rPr>
-          <w:rFonts w:ascii="Arial" w:eastAsiaTheme="minorEastAsia" w:hAnsi="Arial" w:cs="Arial"/>
-          <w:sz w:val="26"/>
-          <w:szCs w:val="26"/>
-        </w:rPr>
-        <w:t xml:space="preserve"> computational framework</w:t>
+        <w:t>biologically inspired computational framework</w:t>
       </w:r>
       <w:r>
         <w:rPr>
@@ -6087,23 +6718,7 @@
           <w:sz w:val="26"/>
           <w:szCs w:val="26"/>
         </w:rPr>
-        <w:t xml:space="preserve">attended regions in order of decreasing saliency. This efficient approach successfully replicates human search </w:t>
-      </w:r>
-      <w:r>
-        <w:rPr>
-          <w:rFonts w:ascii="Arial" w:eastAsiaTheme="minorEastAsia" w:hAnsi="Arial" w:cs="Arial"/>
-          <w:sz w:val="26"/>
-          <w:szCs w:val="26"/>
-        </w:rPr>
-        <w:t>behaviour</w:t>
-      </w:r>
-      <w:r>
-        <w:rPr>
-          <w:rFonts w:ascii="Arial" w:eastAsiaTheme="minorEastAsia" w:hAnsi="Arial" w:cs="Arial"/>
-          <w:sz w:val="26"/>
-          <w:szCs w:val="26"/>
-        </w:rPr>
-        <w:t xml:space="preserve"> across synthetic and complex natural imagery</w:t>
+        <w:t>attended regions in order of decreasing saliency. This efficient approach successfully replicates human search behaviour across synthetic and complex natural imagery</w:t>
       </w:r>
       <w:r>
         <w:rPr>
@@ -6479,47 +7094,7 @@
           <w:sz w:val="26"/>
           <w:szCs w:val="26"/>
         </w:rPr>
-        <w:t xml:space="preserve">This paper </w:t>
-      </w:r>
-      <w:r>
-        <w:rPr>
-          <w:rFonts w:ascii="Arial" w:eastAsiaTheme="minorEastAsia" w:hAnsi="Arial" w:cs="Arial"/>
-          <w:sz w:val="26"/>
-          <w:szCs w:val="26"/>
-        </w:rPr>
-        <w:t xml:space="preserve">links saliency with attention mechanisms and perception and is relevant to the </w:t>
-      </w:r>
-      <w:r>
-        <w:rPr>
-          <w:rFonts w:ascii="Arial" w:eastAsiaTheme="minorEastAsia" w:hAnsi="Arial" w:cs="Arial"/>
-          <w:sz w:val="26"/>
-          <w:szCs w:val="26"/>
-        </w:rPr>
-        <w:t xml:space="preserve">biological foundations section of the </w:t>
-      </w:r>
-      <w:r>
-        <w:rPr>
-          <w:rFonts w:ascii="Arial" w:eastAsiaTheme="minorEastAsia" w:hAnsi="Arial" w:cs="Arial"/>
-          <w:sz w:val="26"/>
-          <w:szCs w:val="26"/>
-        </w:rPr>
-        <w:t xml:space="preserve">study </w:t>
-      </w:r>
-      <w:r>
-        <w:rPr>
-          <w:rFonts w:ascii="Arial" w:eastAsiaTheme="minorEastAsia" w:hAnsi="Arial" w:cs="Arial"/>
-          <w:sz w:val="26"/>
-          <w:szCs w:val="26"/>
-        </w:rPr>
-        <w:t>notes</w:t>
-      </w:r>
-      <w:r>
-        <w:rPr>
-          <w:rFonts w:ascii="Arial" w:eastAsiaTheme="minorEastAsia" w:hAnsi="Arial" w:cs="Arial"/>
-          <w:sz w:val="26"/>
-          <w:szCs w:val="26"/>
-        </w:rPr>
-        <w:t>.</w:t>
+        <w:t>This paper links saliency with attention mechanisms and perception and is relevant to the biological foundations section of the study notes.</w:t>
       </w:r>
     </w:p>
     <w:p>
@@ -8115,6 +8690,7 @@
   <w:style w:type="character" w:default="1" w:styleId="DefaultParagraphFont">
     <w:name w:val="Default Paragraph Font"/>
     <w:uiPriority w:val="1"/>
+    <w:semiHidden/>
     <w:unhideWhenUsed/>
   </w:style>
   <w:style w:type="table" w:default="1" w:styleId="TableNormal">

</xml_diff>